<commit_message>
docs: xác minh TB 917, 924, 948 bằng bản gốc — khớp số, ngày, trích yếu
- TB v5: thêm tên gọi công cụ tại TB 948 (Track Changes, "Xác minh căn cứ (Claude)")
- BC quá trình v3: cập nhật dòng trạng thái rà soát 897 (Track Changes)
- Phiếu rà soát 897 vòng 2 (TB v5, HD v4): đóng M4-01 → M4-03
- Đề xuất bổ sung 3 TB vào KTC-Database/02 (tên chuẩn + metadata)
- Nền là bản người dùng đã chấp nhận thay đổi trong Word (27/9)

Co-Authored-By: Claude Opus 5.5 <noreply@anthropic.com>
</commit_message>
<xml_diff>
--- a/30-Ket-Qua/2026-09-26/Soan-Thao/TB_Huong-dan-su-dung-cong-cu-AI-KTC-Quan-tri_20260926_v5_TrackChanges.docx
+++ b/30-Ket-Qua/2026-09-26/Soan-Thao/TB_Huong-dan-su-dung-cong-cu-AI-KTC-Quan-tri_20260926_v5_TrackChanges.docx
@@ -1,6 +1,6 @@
 
 <file path=word/document.xml><?xml version="1.0" encoding="utf-8"?>
-<w:document xmlns:wpc="http://schemas.microsoft.com/office/word/2010/wordprocessingCanvas" xmlns:cx="http://schemas.microsoft.com/office/drawing/2014/chartex" xmlns:cx1="http://schemas.microsoft.com/office/drawing/2015/9/8/chartex" xmlns:cx2="http://schemas.microsoft.com/office/drawing/2015/10/21/chartex" xmlns:cx3="http://schemas.microsoft.com/office/drawing/2016/5/9/chartex" xmlns:cx4="http://schemas.microsoft.com/office/drawing/2016/5/10/chartex" xmlns:cx5="http://schemas.microsoft.com/office/drawing/2016/5/11/chartex" xmlns:cx6="http://schemas.microsoft.com/office/drawing/2016/5/12/chartex" xmlns:cx7="http://schemas.microsoft.com/office/drawing/2016/5/13/chartex" xmlns:cx8="http://schemas.microsoft.com/office/drawing/2016/5/14/chartex" xmlns:mc="http://schemas.openxmlformats.org/markup-compatibility/2006" xmlns:aink="http://schemas.microsoft.com/office/drawing/2016/ink" xmlns:am3d="http://schemas.microsoft.com/office/drawing/2017/model3d" xmlns:o="urn:schemas-microsoft-com:office:office" xmlns:oel="http://schemas.microsoft.com/office/2019/extlst" xmlns:r="http://schemas.openxmlformats.org/officeDocument/2006/relationships" xmlns:m="http://schemas.openxmlformats.org/officeDocument/2006/math" xmlns:v="urn:schemas-microsoft-com:vml" xmlns:wp14="http://schemas.microsoft.com/office/word/2010/wordprocessingDrawing" xmlns:wp="http://schemas.openxmlformats.org/drawingml/2006/wordprocessingDrawing" xmlns:w10="urn:schemas-microsoft-com:office:word" xmlns:w="http://schemas.openxmlformats.org/wordprocessingml/2006/main" xmlns:w14="http://schemas.microsoft.com/office/word/2010/wordml" xmlns:w15="http://schemas.microsoft.com/office/word/2012/wordml" xmlns:w16cei="http://schemas.microsoft.com/office/word/2026/wordml/cei" xmlns:w16cex="http://schemas.microsoft.com/office/word/2018/wordml/cex" xmlns:w16cid="http://schemas.microsoft.com/office/word/2016/wordml/cid" xmlns:w16="http://schemas.microsoft.com/office/word/2018/wordml" xmlns:w16du="http://schemas.microsoft.com/office/word/2023/wordml/word16du" xmlns:w16sdtdh="http://schemas.microsoft.com/office/word/2020/wordml/sdtdatahash" xmlns:w16sdtfl="http://schemas.microsoft.com/office/word/2024/wordml/sdtformatlock" xmlns:w16se="http://schemas.microsoft.com/office/word/2015/wordml/symex" xmlns:wpg="http://schemas.microsoft.com/office/word/2010/wordprocessingGroup" xmlns:wpi="http://schemas.microsoft.com/office/word/2010/wordprocessingInk" xmlns:wne="http://schemas.microsoft.com/office/word/2006/wordml" xmlns:wps="http://schemas.microsoft.com/office/word/2010/wordprocessingShape" mc:Ignorable="w14 w15 w16se w16cid w16 w16cex w16sdtdh w16sdtfl w16du wp14">
+<w:document xmlns:wpc="http://schemas.microsoft.com/office/word/2010/wordprocessingCanvas" xmlns:cx="http://schemas.microsoft.com/office/drawing/2014/chartex" xmlns:cx1="http://schemas.microsoft.com/office/drawing/2015/9/8/chartex" xmlns:cx2="http://schemas.microsoft.com/office/drawing/2015/10/21/chartex" xmlns:cx3="http://schemas.microsoft.com/office/drawing/2016/5/9/chartex" xmlns:cx4="http://schemas.microsoft.com/office/drawing/2016/5/10/chartex" xmlns:cx5="http://schemas.microsoft.com/office/drawing/2016/5/11/chartex" xmlns:cx6="http://schemas.microsoft.com/office/drawing/2016/5/12/chartex" xmlns:cx7="http://schemas.microsoft.com/office/drawing/2016/5/13/chartex" xmlns:cx8="http://schemas.microsoft.com/office/drawing/2016/5/14/chartex" xmlns:mc="http://schemas.openxmlformats.org/markup-compatibility/2006" xmlns:aink="http://schemas.microsoft.com/office/drawing/2016/ink" xmlns:am3d="http://schemas.microsoft.com/office/drawing/2017/model3d" xmlns:o="urn:schemas-microsoft-com:office:office" xmlns:oel="http://schemas.microsoft.com/office/2019/extlst" xmlns:r="http://schemas.openxmlformats.org/officeDocument/2006/relationships" xmlns:m="http://schemas.openxmlformats.org/officeDocument/2006/math" xmlns:v="urn:schemas-microsoft-com:vml" xmlns:wp14="http://schemas.microsoft.com/office/word/2010/wordprocessingDrawing" xmlns:wp="http://schemas.openxmlformats.org/drawingml/2006/wordprocessingDrawing" xmlns:w10="urn:schemas-microsoft-com:office:word" xmlns:w="http://schemas.openxmlformats.org/wordprocessingml/2006/main" xmlns:w14="http://schemas.microsoft.com/office/word/2010/wordml" xmlns:w15="http://schemas.microsoft.com/office/word/2012/wordml" xmlns:w16cex="http://schemas.microsoft.com/office/word/2018/wordml/cex" xmlns:w16cid="http://schemas.microsoft.com/office/word/2016/wordml/cid" xmlns:w16="http://schemas.microsoft.com/office/word/2018/wordml" xmlns:w16du="http://schemas.microsoft.com/office/word/2023/wordml/word16du" xmlns:w16sdtdh="http://schemas.microsoft.com/office/word/2020/wordml/sdtdatahash" xmlns:w16se="http://schemas.microsoft.com/office/word/2015/wordml/symex" xmlns:wpg="http://schemas.microsoft.com/office/word/2010/wordprocessingGroup" xmlns:wpi="http://schemas.microsoft.com/office/word/2010/wordprocessingInk" xmlns:wne="http://schemas.microsoft.com/office/word/2006/wordml" xmlns:wps="http://schemas.microsoft.com/office/word/2010/wordprocessingShape" mc:Ignorable="w14 w15 w16se w16cid w16 w16cex w16sdtdh wp14">
   <w:body>
     <w:tbl>
       <w:tblPr>
@@ -139,7 +139,7 @@
                     </wp:anchor>
                   </w:drawing>
                 </mc:Choice>
-                <mc:Fallback>
+                <mc:Fallback xmlns:w16sdtfl="http://schemas.microsoft.com/office/word/2024/wordml/sdtformatlock" xmlns:w16cei="http://schemas.microsoft.com/office/word/2026/wordml/cei">
                   <w:pict>
                     <v:line w14:anchorId="39080EFC" id="Line 32" o:spid="_x0000_s1026" style="position:absolute;z-index:251661312;visibility:visible;mso-wrap-style:square;mso-wrap-distance-left:0;mso-wrap-distance-top:0;mso-wrap-distance-right:0;mso-wrap-distance-bottom:0;mso-position-horizontal:absolute;mso-position-horizontal-relative:text;mso-position-vertical:absolute;mso-position-vertical-relative:text" from="64.3pt,1.85pt" to="132.15pt,1.9pt" o:gfxdata="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"/>
                   </w:pict>
@@ -300,35 +300,22 @@
                     </wp:anchor>
                   </w:drawing>
                 </mc:Choice>
-                <mc:Fallback>
+                <mc:Fallback xmlns:w16sdtfl="http://schemas.microsoft.com/office/word/2024/wordml/sdtformatlock" xmlns:w16cei="http://schemas.microsoft.com/office/word/2026/wordml/cei">
                   <w:pict>
                     <v:line w14:anchorId="444700A8" id="Line 31" o:spid="_x0000_s1026" style="position:absolute;z-index:251660288;visibility:visible;mso-wrap-style:square;mso-wrap-distance-left:0;mso-wrap-distance-top:0;mso-wrap-distance-right:2pt;mso-wrap-distance-bottom:1.5pt;mso-position-horizontal:absolute;mso-position-horizontal-relative:text;mso-position-vertical:absolute;mso-position-vertical-relative:text" from="51.3pt,-.35pt" to="223.3pt,-.3pt" o:gfxdata="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"/>
                   </w:pict>
                 </mc:Fallback>
               </mc:AlternateContent>
             </w:r>
-            <w:del w:id="1001" w:author="Tiếp thu thẩm định lần 2 (Claude)" w:date="2026-09-27T06:30:22Z">
-              <w:r>
-                <w:rPr>
-                  <w:bCs/>
-                  <w:i/>
-                  <w:sz w:val="28"/>
-                  <w:szCs w:val="26"/>
-                </w:rPr>
-                <w:delText>Quảng Ngãi, ngày      tháng 9 năm 2026</w:delText>
-              </w:r>
-            </w:del>
-            <w:ins w:id="1002" w:author="Tiếp thu thẩm định lần 2 (Claude)" w:date="2026-09-27T06:30:22Z">
-              <w:r>
-                <w:rPr>
-                  <w:bCs/>
-                  <w:i/>
-                  <w:sz w:val="28"/>
-                  <w:szCs w:val="26"/>
-                </w:rPr>
-                <w:t xml:space="preserve">Quảng Ngãi, ngày      tháng      năm 2026</w:t>
-              </w:r>
-            </w:ins>
+            <w:r>
+              <w:rPr>
+                <w:bCs/>
+                <w:i/>
+                <w:sz w:val="28"/>
+                <w:szCs w:val="26"/>
+              </w:rPr>
+              <w:t>Quảng Ngãi, ngày      tháng      năm 2026</w:t>
+            </w:r>
           </w:p>
         </w:tc>
       </w:tr>
@@ -381,7 +368,6 @@
       <w:r>
         <w:rPr>
           <w:b/>
-          <w:i w:val="0"/>
           <w:sz w:val="28"/>
           <w:szCs w:val="28"/>
         </w:rPr>
@@ -392,14 +378,6 @@
           <w:b/>
           <w:sz w:val="28"/>
           <w:szCs w:val="28"/>
-          <w:rPrChange w:id="1048" w:author="Rà soát 897 vòng 1 (Claude)" w:date="2026-09-27T06:30:22Z">
-            <w:rPr>
-              <w:b/>
-              <w:i/>
-              <w:sz w:val="28"/>
-              <w:szCs w:val="28"/>
-            </w:rPr>
-          </w:rPrChange>
         </w:rPr>
         <w:t>(KTC-Quan-tri)</w:t>
       </w:r>
@@ -474,7 +452,7 @@
               </wp:anchor>
             </w:drawing>
           </mc:Choice>
-          <mc:Fallback>
+          <mc:Fallback xmlns:w16sdtfl="http://schemas.microsoft.com/office/word/2024/wordml/sdtformatlock" xmlns:w16cei="http://schemas.microsoft.com/office/word/2026/wordml/cei">
             <w:pict>
               <v:line w14:anchorId="2D1631D2" id="Straight Connector 10" o:spid="_x0000_s1026" style="position:absolute;z-index:251659264;visibility:visible;mso-wrap-style:square;mso-wrap-distance-left:0;mso-wrap-distance-top:0;mso-wrap-distance-right:0;mso-wrap-distance-bottom:0;mso-position-horizontal:absolute;mso-position-horizontal-relative:text;mso-position-vertical:absolute;mso-position-vertical-relative:text" from="182.95pt,3.3pt" to="268.45pt,3.3pt" o:gfxdata="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" strokecolor="#156082">
                 <v:stroke joinstyle="miter"/>
@@ -560,24 +538,21 @@
         <w:ind w:firstLine="720"/>
         <w:jc w:val="both"/>
         <w:rPr>
-          <w:ins w:id="1047" w:author="Rà soát 897 vòng 1 (Claude)" w:date="2026-09-27T06:30:22Z"/>
           <w:i/>
           <w:iCs/>
           <w:sz w:val="28"/>
           <w:szCs w:val="28"/>
         </w:rPr>
       </w:pPr>
-      <w:ins w:id="1046" w:author="Rà soát 897 vòng 1 (Claude)" w:date="2026-09-27T06:30:22Z">
-        <w:r>
-          <w:rPr>
-            <w:i/>
-            <w:iCs/>
-            <w:sz w:val="28"/>
-            <w:szCs w:val="28"/>
-          </w:rPr>
-          <w:t xml:space="preserve">Căn cứ Thông báo số 1056/TB-CĐKT ngày 16 tháng 9 năm 2026 của Trường Cao đẳng Kon Tum hướng dẫn sử dụng Skill “tao-skill-va-prompt-chuan” để xây dựng các Skill chuyên dụng phục vụ công việc tại các đơn vị thuộc Trường;</w:t>
-        </w:r>
-      </w:ins>
+      <w:r>
+        <w:rPr>
+          <w:i/>
+          <w:iCs/>
+          <w:sz w:val="28"/>
+          <w:szCs w:val="28"/>
+        </w:rPr>
+        <w:t>Căn cứ Thông báo số 1056/TB-CĐKT ngày 16 tháng 9 năm 2026 của Trường Cao đẳng Kon Tum hướng dẫn sử dụng Skill “tao-skill-va-prompt-chuan” để xây dựng các Skill chuyên dụng phục vụ công việc tại các đơn vị thuộc Trường;</w:t>
+      </w:r>
     </w:p>
     <w:p>
       <w:pPr>
@@ -693,6 +668,7 @@
         <w:rPr>
           <w:sz w:val="28"/>
         </w:rPr>
+        <w:lastRenderedPageBreak/>
         <w:t>b) Khác với các công cụ AI nhà trường đã hướng dẫn trước đây (mỗi công cụ là một kỹ năng – skill, gồm tệp hướng dẫn SKILL.md và tài liệu kèm theo), KTC-Quan-tri được đóng gói dưới dạng plugin (bộ công cụ tích hợp) trên nền tảng Claude AI, gồm các thành phần:</w:t>
       </w:r>
     </w:p>
@@ -709,24 +685,206 @@
         <w:rPr>
           <w:sz w:val="28"/>
         </w:rPr>
-        <w:t xml:space="preserve">- 8 kỹ năng (skills): xây dựng kế hoạch; tổng hợp báo cáo; theo dõi nhiệm vụ; quản trị, điều phối; lập KPI cá nhân; tự đánh giá KPI cá nhân; soạn thảo văn bản; chuẩn thể thức sản phẩm. </w:t>
+        <w:t>- 8 kỹ năng (skills): xây dựng kế hoạch; tổng hợp báo cáo; theo dõi nhiệm vụ; quản trị, điều phối; lập KPI cá nhân; tự đánh giá KPI cá nhân; soạn thảo văn bản; chuẩn thể thức sản phẩm. Claude tự chọn kỹ năng phù hợp với yêu cầu; đối với việc lập, tự đánh giá KPI cá nhân, báo cáo cấp Trường hoặc có dữ liệu cá nhân, người dùng gọi đích danh kỹ năng (gõ “/”) hoặc kiểm tra kỹ năng đã được kích hoạt trước khi dùng kết quả.</w:t>
       </w:r>
-      <w:del w:id="1003" w:author="Tiếp thu thẩm định lần 2 (Claude)" w:date="2026-09-27T06:30:22Z">
+    </w:p>
+    <w:p>
+      <w:pPr>
+        <w:spacing w:before="120" w:after="120"/>
+        <w:ind w:firstLine="720"/>
+        <w:jc w:val="both"/>
+        <w:rPr>
+          <w:sz w:val="28"/>
+        </w:rPr>
+      </w:pPr>
+      <w:r>
+        <w:rPr>
+          <w:sz w:val="28"/>
+        </w:rPr>
+        <w:t>- 7 tác tử kiểm tra (agents): chạy độc lập để kiểm hồ sơ kế hoạch, báo cáo của đơn vị; tra cứu căn cứ; kiểm tra sản phẩm trước khi giao; quét hiệu lực văn bản viện dẫn; kiểm minh chứng; tự học và đề xuất cải tiến.</w:t>
+      </w:r>
+    </w:p>
+    <w:p>
+      <w:pPr>
+        <w:spacing w:before="120" w:after="120"/>
+        <w:ind w:firstLine="720"/>
+        <w:jc w:val="both"/>
+        <w:rPr>
+          <w:sz w:val="28"/>
+        </w:rPr>
+      </w:pPr>
+      <w:r>
+        <w:rPr>
+          <w:sz w:val="28"/>
+        </w:rPr>
+        <w:t>- Các thao tác tự động (hooks) trên Claude Cowork và Claude Code, từ phiên bản 1.3.0: tự kiểm tra phiên bản; chặn ghi, xóa đối với kho KTC-Database và biểu mẫu chuẩn; đo thể thức tệp vừa tạo; ghi nhật ký vận hành, theo mặc định chỉ gồm thông tin mô tả, không ghi nội dung lời nhắn (trừ khi người dùng chủ động chọn ghi), tự xóa sau 30 ngày. Thao tác chặn ghi không kiểm được mã lệnh do AI viết bên trong chương trình và không chạy khi máy thiếu Python (khi đó đầu phiên không hiện dòng “guard: HOẠT ĐỘNG”); phân quyền chỉ đọc kho KTC-Database trên Google Drive vẫn là biện pháp bảo vệ chính.</w:t>
+      </w:r>
+    </w:p>
+    <w:p>
+      <w:pPr>
+        <w:spacing w:before="120" w:after="120"/>
+        <w:ind w:firstLine="720"/>
+        <w:jc w:val="both"/>
+        <w:rPr>
+          <w:sz w:val="28"/>
+        </w:rPr>
+      </w:pPr>
+      <w:r>
+        <w:rPr>
+          <w:sz w:val="28"/>
+        </w:rPr>
+        <w:t>- Các công cụ tính toán (script): tính điểm, hệ số, tỷ lệ KPI, kiểm tra biểu mẫu Excel bằng thuật toán cố định, không phụ thuộc cách diễn đạt của AI.</w:t>
+      </w:r>
+    </w:p>
+    <w:p>
+      <w:pPr>
+        <w:spacing w:before="120" w:after="120"/>
+        <w:ind w:firstLine="720"/>
+        <w:jc w:val="both"/>
+        <w:rPr>
+          <w:sz w:val="28"/>
+        </w:rPr>
+      </w:pPr>
+      <w:r>
+        <w:rPr>
+          <w:sz w:val="28"/>
+        </w:rPr>
+        <w:t>c) Nền tảng sử dụng: Bộ công cụ vận hành trên 3 nền tảng của Claude AI, mỗi nền tảng chạy được một phần hoặc toàn bộ thành phần:</w:t>
+      </w:r>
+    </w:p>
+    <w:p>
+      <w:pPr>
+        <w:spacing w:before="120" w:after="120"/>
+        <w:ind w:firstLine="720"/>
+        <w:jc w:val="both"/>
+        <w:rPr>
+          <w:sz w:val="28"/>
+        </w:rPr>
+      </w:pPr>
+      <w:r>
+        <w:rPr>
+          <w:sz w:val="28"/>
+        </w:rPr>
+        <w:t>- Claude (trò chuyện trên trình duyệt hoặc ứng dụng Claude Desktop): dùng được 8 kỹ năng; phù hợp lập kế hoạch, báo cáo của đơn vị, KPI cá nhân, soạn thảo văn bản; không có tác tử kiểm tra, thao tác tự động và chỉ xử lý nguồn dữ liệu người dùng chủ động cung cấp hoặc cho phép kết nối.</w:t>
+      </w:r>
+    </w:p>
+    <w:p>
+      <w:pPr>
+        <w:spacing w:before="120" w:after="120"/>
+        <w:ind w:firstLine="720"/>
+        <w:jc w:val="both"/>
+        <w:rPr>
+          <w:sz w:val="28"/>
+        </w:rPr>
+      </w:pPr>
+      <w:r>
+        <w:rPr>
+          <w:sz w:val="28"/>
+        </w:rPr>
+        <w:t>- Claude Cowork (trong ứng dụng Claude Desktop): dùng được kỹ năng, tác tử kiểm tra và thao tác tự động; làm việc trực tiếp với tệp trên máy tính khi được cấp quyền; phù hợp tổng hợp nhiều hồ sơ đơn vị.</w:t>
+      </w:r>
+    </w:p>
+    <w:p>
+      <w:pPr>
+        <w:spacing w:before="120" w:after="120"/>
+        <w:ind w:firstLine="720"/>
+        <w:jc w:val="both"/>
+        <w:rPr>
+          <w:sz w:val="28"/>
+        </w:rPr>
+      </w:pPr>
+      <w:r>
+        <w:rPr>
+          <w:sz w:val="28"/>
+        </w:rPr>
+        <w:t>- Claude Code: chạy đầy đủ mọi thành phần, là nền tảng đã được kiểm thử trên dữ liệu giả lập, đo được thể thức thật của tệp Word và theo dõi thay đổi (Track Changes); Phòng TH-HC&amp;QT sử dụng khi tổng hợp, kiểm tra cấp Trường.</w:t>
+      </w:r>
+    </w:p>
+    <w:p>
+      <w:pPr>
+        <w:spacing w:before="120" w:after="120"/>
+        <w:ind w:firstLine="720"/>
+        <w:jc w:val="both"/>
+        <w:rPr>
+          <w:sz w:val="28"/>
+        </w:rPr>
+      </w:pPr>
+      <w:r>
+        <w:rPr>
+          <w:sz w:val="28"/>
+        </w:rPr>
+        <w:t>- Trên Claude và Claude Cowork, việc đo thể thức và theo dõi thay đổi chỉ thực hiện được khi môi trường chạy được công cụ đo; trường hợp không chạy được, Bộ công cụ ghi rõ “chưa xác minh bằng công cụ đo”, người dùng không coi sản phẩm là đã đạt chuẩn thể thức.</w:t>
+      </w:r>
+    </w:p>
+    <w:p>
+      <w:pPr>
+        <w:spacing w:before="120" w:after="120"/>
+        <w:ind w:firstLine="720"/>
+        <w:jc w:val="both"/>
+        <w:rPr>
+          <w:sz w:val="28"/>
+        </w:rPr>
+      </w:pPr>
+      <w:r>
+        <w:rPr>
+          <w:b/>
+          <w:i/>
+          <w:sz w:val="28"/>
+        </w:rPr>
+        <w:t>Lưu ý:</w:t>
+      </w:r>
+    </w:p>
+    <w:p>
+      <w:pPr>
+        <w:spacing w:before="120" w:after="120"/>
+        <w:ind w:firstLine="720"/>
+        <w:jc w:val="both"/>
+        <w:rPr>
+          <w:sz w:val="28"/>
+        </w:rPr>
+      </w:pPr>
+      <w:r>
+        <w:rPr>
+          <w:sz w:val="28"/>
+        </w:rPr>
+        <w:t>- Người dùng chỉ cần dùng câu lệnh mẫu trong Tài liệu hướng dẫn sử dụng chi tiết, đính kèm tệp dữ liệu; không phải tự viết câu lệnh (prompt).</w:t>
+      </w:r>
+    </w:p>
+    <w:p>
+      <w:pPr>
+        <w:spacing w:before="120" w:after="120"/>
+        <w:ind w:firstLine="720"/>
+        <w:jc w:val="both"/>
+        <w:rPr>
+          <w:sz w:val="28"/>
+        </w:rPr>
+      </w:pPr>
+      <w:r>
+        <w:rPr>
+          <w:sz w:val="28"/>
+        </w:rPr>
+        <w:t xml:space="preserve">- Bộ công cụ không thay thế bước rà soát dự thảo văn bản trước khi trình ký bằng Skill “ktc-ra-soat-897” theo </w:t>
+      </w:r>
+      <w:r>
+        <w:rPr>
+          <w:sz w:val="28"/>
+        </w:rPr>
+        <w:t xml:space="preserve">Thông báo số 948/TB-CĐKT ngày 17 tháng 8 năm 2026</w:t>
+      </w:r>
+      <w:ins w:id="1001" w:author="Xác minh căn cứ (Claude)" w:date="2026-09-27T07:11:26Z">
         <w:r>
           <w:rPr>
             <w:sz w:val="28"/>
           </w:rPr>
-          <w:delText xml:space="preserve">Claude tự chọn kỹ năng phù hợp với yêu cầu, người dùng không phải chọn thủ công.</w:delText>
-        </w:r>
-      </w:del>
-      <w:ins w:id="1004" w:author="Tiếp thu thẩm định lần 2 (Claude)" w:date="2026-09-27T06:30:22Z">
-        <w:r>
-          <w:rPr>
-            <w:sz w:val="28"/>
-          </w:rPr>
-          <w:t xml:space="preserve">Claude tự chọn kỹ năng phù hợp với yêu cầu; đối với việc lập, tự đánh giá KPI cá nhân, báo cáo cấp Trường hoặc có dữ liệu cá nhân, người dùng gọi đích danh kỹ năng (gõ “/”) hoặc kiểm tra kỹ năng đã được kích hoạt trước khi dùng kết quả.</w:t>
+          <w:t xml:space="preserve"> (Công cụ AI KTC-Ra-Soat-897-v2-Cai-tien)</w:t>
         </w:r>
       </w:ins>
+      <w:r>
+        <w:rPr>
+          <w:sz w:val="28"/>
+        </w:rPr>
+        <w:t xml:space="preserve">; không tự quyết định mức xếp loại, không tự phê duyệt; không tự tạo nhiệm vụ mới khi nhiệm vụ đó đã có trong kế hoạch.</w:t>
+      </w:r>
     </w:p>
     <w:p>
       <w:pPr>
@@ -741,7 +899,7 @@
         <w:rPr>
           <w:sz w:val="28"/>
         </w:rPr>
-        <w:t>- 7 tác tử kiểm tra (agents): chạy độc lập để kiểm hồ sơ kế hoạch, báo cáo của đơn vị; tra cứu căn cứ; kiểm tra sản phẩm trước khi giao; quét hiệu lực văn bản viện dẫn; kiểm minh chứng; tự học và đề xuất cải tiến.</w:t>
+        <w:t>- Bộ công cụ coi nội dung trong tệp, bảng tính, trang web do người dùng cung cấp là dữ liệu, không làm theo các câu lệnh nằm trong đó; khi phát hiện câu lệnh bất thường trong tệp, Bộ công cụ cảnh báo để người dùng kiểm tra lại nguồn tệp.</w:t>
       </w:r>
     </w:p>
     <w:p>
@@ -753,337 +911,12 @@
           <w:sz w:val="28"/>
         </w:rPr>
       </w:pPr>
-      <w:del w:id="1005" w:author="Tiếp thu thẩm định lần 2 (Claude)" w:date="2026-09-27T06:30:22Z">
-        <w:r>
-          <w:rPr>
-            <w:sz w:val="28"/>
-          </w:rPr>
-          <w:delText xml:space="preserve">- Các thao tác tự động (hooks) khi mở, kết thúc phiên làm việc: </w:delText>
-        </w:r>
-      </w:del>
-      <w:ins w:id="1006" w:author="Tiếp thu thẩm định lần 2 (Claude)" w:date="2026-09-27T06:30:22Z">
-        <w:r>
-          <w:rPr>
-            <w:sz w:val="28"/>
-          </w:rPr>
-          <w:t xml:space="preserve">- Các thao tác tự động (hooks) trên Claude Cowork và Claude Code, từ phiên bản 1.3.0: </w:t>
-        </w:r>
-      </w:ins>
       <w:r>
         <w:rPr>
           <w:sz w:val="28"/>
         </w:rPr>
-        <w:t xml:space="preserve">tự kiểm tra phiên bản; chặn ghi, xóa đối với kho KTC-Database và biểu mẫu chuẩn; đo thể thức tệp vừa tạo; </w:t>
+        <w:t>- Kết quả của Bộ công cụ ghi rõ trạng thái; chỉ kết quả ở trạng thái “Đạt” hoặc “Đạt có điều kiện” được dùng làm cơ sở để đơn vị, người soạn thảo kiểm tra, hoàn thiện sản phẩm chính thức. Kết quả là bản nháp chưa đối chiếu dữ liệu gốc hoặc có ghi “đối chiếu gần đúng” thì không được dùng làm cơ sở hoàn thiện số liệu chính thức cho đến khi đơn vị đối chiếu lại với dữ liệu gốc và Lãnh đạo đơn vị kiểm tra thủ công trước khi ký; trong giai đoạn thí điểm, kết quả ghi rõ “dữ liệu thí điểm”.</w:t>
       </w:r>
-      <w:del w:id="1007" w:author="Tiếp thu thẩm định lần 2 (Claude)" w:date="2026-09-27T06:30:22Z">
-        <w:r>
-          <w:rPr>
-            <w:sz w:val="28"/>
-          </w:rPr>
-          <w:delText xml:space="preserve">ghi nhật ký vận hành (không ghi nội dung dữ liệu cá nhân).</w:delText>
-        </w:r>
-      </w:del>
-      <w:ins w:id="1008" w:author="Tiếp thu thẩm định lần 2 (Claude)" w:date="2026-09-27T06:30:22Z">
-        <w:r>
-          <w:rPr>
-            <w:sz w:val="28"/>
-          </w:rPr>
-          <w:t xml:space="preserve">ghi nhật ký vận hành, theo mặc định chỉ gồm thông tin mô tả, không ghi nội dung lời nhắn (trừ khi người dùng chủ động chọn ghi), tự xóa sau 30 ngày. Thao tác chặn ghi không kiểm được mã lệnh do AI viết bên trong chương trình và không chạy khi máy thiếu Python (khi đó đầu phiên không hiện dòng “guard: HOẠT ĐỘNG”); phân quyền chỉ đọc kho KTC-Database trên Google Drive vẫn là biện pháp bảo vệ chính.</w:t>
-        </w:r>
-      </w:ins>
-    </w:p>
-    <w:p>
-      <w:pPr>
-        <w:spacing w:before="120" w:after="120"/>
-        <w:ind w:firstLine="720"/>
-        <w:jc w:val="both"/>
-        <w:rPr>
-          <w:sz w:val="28"/>
-        </w:rPr>
-      </w:pPr>
-      <w:r>
-        <w:rPr>
-          <w:sz w:val="28"/>
-        </w:rPr>
-        <w:t>- Các công cụ tính toán (script): tính điểm, hệ số, tỷ lệ KPI, kiểm tra biểu mẫu Excel bằng thuật toán cố định, không phụ thuộc cách diễn đạt của AI.</w:t>
-      </w:r>
-    </w:p>
-    <w:p>
-      <w:pPr>
-        <w:spacing w:before="120" w:after="120"/>
-        <w:ind w:firstLine="720"/>
-        <w:jc w:val="both"/>
-        <w:rPr>
-          <w:sz w:val="28"/>
-        </w:rPr>
-      </w:pPr>
-      <w:r>
-        <w:rPr>
-          <w:sz w:val="28"/>
-        </w:rPr>
-        <w:t>c) Nền tảng sử dụng: Bộ công cụ vận hành trên 3 nền tảng của Claude AI, mỗi nền tảng chạy được một phần hoặc toàn bộ thành phần:</w:t>
-      </w:r>
-    </w:p>
-    <w:p>
-      <w:pPr>
-        <w:spacing w:before="120" w:after="120"/>
-        <w:ind w:firstLine="720"/>
-        <w:jc w:val="both"/>
-        <w:rPr>
-          <w:sz w:val="28"/>
-        </w:rPr>
-      </w:pPr>
-      <w:r>
-        <w:rPr>
-          <w:sz w:val="28"/>
-        </w:rPr>
-        <w:t xml:space="preserve">- Claude (trò chuyện trên trình duyệt hoặc ứng dụng Claude Desktop): dùng được 8 kỹ năng; phù hợp lập kế hoạch, báo cáo của đơn vị, </w:t>
-      </w:r>
-      <w:r>
-        <w:rPr>
-          <w:sz w:val="28"/>
-        </w:rPr>
-        <w:t xml:space="preserve">KPI cá nhân, soạn thảo văn bản; không có tác tử kiểm tra, thao tác tự động và </w:t>
-      </w:r>
-      <w:del w:id="1011" w:author="Tiếp thu thẩm định lần 2 (Claude)" w:date="2026-09-27T06:30:22Z">
-        <w:r>
-          <w:rPr>
-            <w:sz w:val="28"/>
-          </w:rPr>
-          <w:delText xml:space="preserve">chỉ xử lý tệp đính kèm trong cuộc trò chuyện.</w:delText>
-        </w:r>
-      </w:del>
-      <w:ins w:id="1012" w:author="Tiếp thu thẩm định lần 2 (Claude)" w:date="2026-09-27T06:30:22Z">
-        <w:r>
-          <w:rPr>
-            <w:sz w:val="28"/>
-          </w:rPr>
-          <w:t xml:space="preserve">chỉ xử lý nguồn dữ liệu người dùng chủ động cung cấp hoặc cho phép kết nối.</w:t>
-        </w:r>
-      </w:ins>
-    </w:p>
-    <w:p>
-      <w:pPr>
-        <w:spacing w:before="120" w:after="120"/>
-        <w:ind w:firstLine="720"/>
-        <w:jc w:val="both"/>
-        <w:rPr>
-          <w:sz w:val="28"/>
-        </w:rPr>
-      </w:pPr>
-      <w:r>
-        <w:rPr>
-          <w:sz w:val="28"/>
-        </w:rPr>
-        <w:t>- Claude Cowork (trong ứng dụng Claude Desktop): dùng được kỹ năng, tác tử kiểm tra và thao tác tự động; làm việc trực tiếp với tệp trên máy tính khi được cấp quyền; phù hợp tổng hợp nhiều hồ sơ đơn vị.</w:t>
-      </w:r>
-    </w:p>
-    <w:p>
-      <w:pPr>
-        <w:spacing w:before="120" w:after="120"/>
-        <w:ind w:firstLine="720"/>
-        <w:jc w:val="both"/>
-        <w:rPr>
-          <w:sz w:val="28"/>
-        </w:rPr>
-      </w:pPr>
-      <w:r>
-        <w:rPr>
-          <w:sz w:val="28"/>
-        </w:rPr>
-        <w:t xml:space="preserve">- Claude Code: chạy đầy đủ mọi thành phần, </w:t>
-      </w:r>
-      <w:r>
-        <w:rPr>
-          <w:sz w:val="28"/>
-        </w:rPr>
-        <w:t xml:space="preserve">là nền tảng </w:t>
-      </w:r>
-      <w:del w:id="1009" w:author="Tiếp thu thẩm định lần 2 (Claude)" w:date="2026-09-27T06:30:22Z">
-        <w:r>
-          <w:rPr>
-            <w:sz w:val="28"/>
-          </w:rPr>
-          <w:delText xml:space="preserve">đã được kiểm thử đầy đủ, đo được</w:delText>
-        </w:r>
-      </w:del>
-      <w:ins w:id="1010" w:author="Tiếp thu thẩm định lần 2 (Claude)" w:date="2026-09-27T06:30:22Z">
-        <w:r>
-          <w:rPr>
-            <w:sz w:val="28"/>
-          </w:rPr>
-          <w:t xml:space="preserve">đã được kiểm thử trên dữ liệu giả lập, đo được</w:t>
-        </w:r>
-      </w:ins>
-      <w:r>
-        <w:rPr>
-          <w:sz w:val="28"/>
-        </w:rPr>
-        <w:t xml:space="preserve"> thể thức thật của tệp Word và theo dõi thay đổi (Track Changes)</w:t>
-      </w:r>
-      <w:r>
-        <w:rPr>
-          <w:sz w:val="28"/>
-        </w:rPr>
-        <w:t xml:space="preserve">; Phòng TH-HC&amp;QT sử dụng khi tổng hợp, kiểm tra cấp Trường.</w:t>
-      </w:r>
-    </w:p>
-    <w:p>
-      <w:pPr>
-        <w:spacing w:before="120" w:after="120"/>
-        <w:ind w:firstLine="720"/>
-        <w:jc w:val="both"/>
-        <w:rPr>
-          <w:sz w:val="28"/>
-        </w:rPr>
-      </w:pPr>
-      <w:r>
-        <w:rPr>
-          <w:sz w:val="28"/>
-        </w:rPr>
-        <w:t xml:space="preserve">- Trên Claude và Claude Cowork, việc đo thể thức và theo dõi thay đổi chỉ thực hiện được khi môi trường chạy được công cụ đo; trường hợp không chạy được, Bộ công cụ ghi rõ </w:t>
-      </w:r>
-      <w:del w:id="1032" w:author="Rà soát 897 vòng 2 (Claude)" w:date="2026-09-27T06:30:22Z">
-        <w:r>
-          <w:rPr>
-            <w:sz w:val="28"/>
-          </w:rPr>
-          <w:delText xml:space="preserve">“chưa đo thể thức”</w:delText>
-        </w:r>
-      </w:del>
-      <w:ins w:id="1033" w:author="Rà soát 897 vòng 2 (Claude)" w:date="2026-09-27T06:30:22Z">
-        <w:r>
-          <w:rPr>
-            <w:sz w:val="28"/>
-          </w:rPr>
-          <w:t xml:space="preserve">“chưa xác minh bằng công cụ đo”</w:t>
-        </w:r>
-      </w:ins>
-      <w:r>
-        <w:rPr>
-          <w:sz w:val="28"/>
-        </w:rPr>
-        <w:t xml:space="preserve">, người dùng không coi sản phẩm là đã đạt chuẩn thể thức.</w:t>
-      </w:r>
-    </w:p>
-    <w:p>
-      <w:pPr>
-        <w:spacing w:before="120" w:after="120"/>
-        <w:ind w:firstLine="720"/>
-        <w:jc w:val="both"/>
-        <w:rPr>
-          <w:sz w:val="28"/>
-        </w:rPr>
-      </w:pPr>
-      <w:del w:id="1040" w:author="Rà soát 897 vòng 1 (Claude)" w:date="2026-09-27T06:30:22Z">
-        <w:r>
-          <w:rPr>
-            <w:b/>
-            <w:i/>
-            <w:sz w:val="28"/>
-          </w:rPr>
-          <w:delText>* Lưu ý:</w:delText>
-        </w:r>
-      </w:del>
-      <w:ins w:id="1041" w:author="Rà soát 897 vòng 1 (Claude)" w:date="2026-09-27T06:30:22Z">
-        <w:r>
-          <w:rPr>
-            <w:b/>
-            <w:i/>
-            <w:sz w:val="28"/>
-          </w:rPr>
-          <w:t xml:space="preserve">Lưu ý:</w:t>
-        </w:r>
-      </w:ins>
-    </w:p>
-    <w:p>
-      <w:pPr>
-        <w:spacing w:before="120" w:after="120"/>
-        <w:ind w:firstLine="720"/>
-        <w:jc w:val="both"/>
-        <w:rPr>
-          <w:sz w:val="28"/>
-        </w:rPr>
-      </w:pPr>
-      <w:r>
-        <w:rPr>
-          <w:sz w:val="28"/>
-        </w:rPr>
-        <w:t>- Người dùng chỉ cần dùng câu lệnh mẫu trong Tài liệu hướng dẫn sử dụng chi tiết, đính kèm tệp dữ liệu; không phải tự viết câu lệnh (prompt).</w:t>
-      </w:r>
-    </w:p>
-    <w:p>
-      <w:pPr>
-        <w:spacing w:before="120" w:after="120"/>
-        <w:ind w:firstLine="720"/>
-        <w:jc w:val="both"/>
-        <w:rPr>
-          <w:sz w:val="28"/>
-        </w:rPr>
-      </w:pPr>
-      <w:r>
-        <w:rPr>
-          <w:sz w:val="28"/>
-        </w:rPr>
-        <w:t xml:space="preserve">- Bộ công cụ không thay thế bước rà soát dự thảo văn bản trước khi trình ký </w:t>
-      </w:r>
-      <w:del w:id="1026" w:author="Rà soát 897 vòng 2 (Claude)" w:date="2026-09-27T06:30:22Z">
-        <w:r>
-          <w:rPr>
-            <w:sz w:val="28"/>
-          </w:rPr>
-          <w:delText xml:space="preserve">bằng công cụ KTC-Ra-Soat-897-v2-Cai-tien theo Thông báo số 948/TB-CĐKT</w:delText>
-        </w:r>
-      </w:del>
-      <w:ins w:id="1027" w:author="Rà soát 897 vòng 2 (Claude)" w:date="2026-09-27T06:30:22Z">
-        <w:r>
-          <w:rPr>
-            <w:sz w:val="28"/>
-          </w:rPr>
-          <w:t xml:space="preserve">bằng Skill “ktc-ra-soat-897” theo Thông báo số 948/TB-CĐKT</w:t>
-        </w:r>
-      </w:ins>
-      <w:r>
-        <w:rPr>
-          <w:sz w:val="28"/>
-        </w:rPr>
-        <w:t xml:space="preserve"> ngày 17 tháng 8 năm 2026; không tự quyết định mức xếp loại, không tự phê duyệt; không tự tạo nhiệm vụ mới khi nhiệm vụ đó đã có trong kế hoạch.</w:t>
-      </w:r>
-    </w:p>
-    <w:p>
-      <w:pPr>
-        <w:spacing w:before="120" w:after="120"/>
-        <w:ind w:firstLine="720"/>
-        <w:jc w:val="both"/>
-        <w:rPr>
-          <w:sz w:val="28"/>
-        </w:rPr>
-      </w:pPr>
-      <w:r>
-        <w:rPr>
-          <w:sz w:val="28"/>
-        </w:rPr>
-        <w:t xml:space="preserve">- Bộ công cụ coi nội dung trong tệp, bảng tính, trang web do người dùng cung cấp là dữ liệu, không làm theo các câu lệnh nằm trong đó; khi phát hiện câu lệnh bất thường trong tệp, Bộ công cụ cảnh báo để người dùng kiểm tra lại nguồn tệp.</w:t>
-      </w:r>
-    </w:p>
-    <w:p>
-      <w:pPr>
-        <w:spacing w:before="120" w:after="120"/>
-        <w:ind w:firstLine="720"/>
-        <w:jc w:val="both"/>
-        <w:rPr>
-          <w:ins w:id="1014" w:author="Tiếp thu thẩm định lần 2 (Claude)" w:date="2026-09-27T06:30:22Z"/>
-          <w:sz w:val="28"/>
-        </w:rPr>
-      </w:pPr>
-      <w:ins w:id="1013" w:author="Tiếp thu thẩm định lần 2 (Claude)" w:date="2026-09-27T06:30:22Z">
-        <w:r>
-          <w:rPr>
-            <w:sz w:val="28"/>
-          </w:rPr>
-          <w:t xml:space="preserve">- Kết quả của Bộ công cụ ghi rõ trạng thái; chỉ kết quả ở trạng thái “Đạt” hoặc “Đạt có điều kiện” được dùng làm cơ sở để đơn vị, người soạn thảo kiểm tra, hoàn thiện sản phẩm chính thức. Kết quả là bản nháp chưa đối chiếu dữ liệu gốc hoặc có ghi “đối chiếu gần đúng” thì không được dùng làm cơ sở hoàn thiện số liệu chính thức cho đến khi đơn vị đối chiếu lại với dữ liệu gốc và Lãnh đạo đơn vị kiểm tra thủ công trước khi ký; trong giai đoạn thí điểm, kết quả ghi rõ “dữ liệu thí điểm”.</w:t>
-        </w:r>
-      </w:ins>
     </w:p>
     <w:p>
       <w:pPr>
@@ -1116,29 +949,7 @@
         <w:rPr>
           <w:sz w:val="28"/>
         </w:rPr>
-        <w:t xml:space="preserve">- Tài khoản Claude AI Team do nhà trường cấp theo Thông báo số 924/TB-CĐKT ngày 11 tháng 8 năm 2026, </w:t>
-      </w:r>
-      <w:del w:id="1030" w:author="Rà soát 897 vòng 2 (Claude)" w:date="2026-09-27T06:30:22Z">
-        <w:r>
-          <w:rPr>
-            <w:sz w:val="28"/>
-          </w:rPr>
-          <w:delText xml:space="preserve">hoặc tài khoản Claude trả phí (Pro, Max).</w:delText>
-        </w:r>
-      </w:del>
-      <w:ins w:id="1031" w:author="Rà soát 897 vòng 2 (Claude)" w:date="2026-09-27T06:30:22Z">
-        <w:r>
-          <w:rPr>
-            <w:sz w:val="28"/>
-          </w:rPr>
-          <w:t xml:space="preserve">hoặc tài khoản Claude trả phí (Pro, Max); trên tài khoản cá nhân chỉ xử lý văn bản đã ban hành, công khai hoặc dữ liệu giả lập, không xử lý dữ liệu nội bộ, dữ liệu cá nhân.</w:t>
-        </w:r>
-      </w:ins>
-      <w:r>
-        <w:rPr>
-          <w:sz w:val="28"/>
-        </w:rPr>
-        <w:t xml:space="preserve"> Tài khoản miễn phí không sử dụng được plugin.</w:t>
+        <w:t>- Tài khoản Claude AI Team do nhà trường cấp theo Thông báo số 924/TB-CĐKT ngày 11 tháng 8 năm 2026, hoặc tài khoản Claude trả phí (Pro, Max); trên tài khoản cá nhân chỉ xử lý văn bản đã ban hành, công khai hoặc dữ liệu giả lập, không xử lý dữ liệu nội bộ, dữ liệu cá nhân. Tài khoản miễn phí không sử dụng được plugin.</w:t>
       </w:r>
     </w:p>
     <w:p>
@@ -1231,55 +1042,7 @@
         <w:rPr>
           <w:sz w:val="28"/>
         </w:rPr>
-        <w:t xml:space="preserve">a) Cài ở cấp tổ chức (Hệ thống Claude AI Team của Trường): Phòng QLKHCN&amp;HTPT, bằng tài khoản Chủ sở hữu (Owner), tải tệp plugin tại mục Organization settings &gt; Plugins &amp; skills &gt; Marketplaces &gt; Add &gt; Upload a plugin; sau đó đặt chế độ phân phối tại mục Inventory &gt; Default access. </w:t>
-      </w:r>
-      <w:r>
-        <w:rPr>
-          <w:sz w:val="28"/>
-        </w:rPr>
-        <w:t xml:space="preserve">Giai đoạn thí điểm (Phòng TH-HC&amp;QT và các đơn vị do Hiệu trưởng chỉ định, từ kỳ báo cáo tháng 10/2026) </w:t>
-      </w:r>
-      <w:del w:id="1015" w:author="Tiếp thu thẩm định lần 2 (Claude)" w:date="2026-09-27T06:30:22Z">
-        <w:r>
-          <w:rPr>
-            <w:sz w:val="28"/>
-          </w:rPr>
-          <w:delText xml:space="preserve">đặt chế độ</w:delText>
-        </w:r>
-      </w:del>
-      <w:del w:id="1016" w:author="Tiếp thu thẩm định lần 2 (Claude)" w:date="2026-09-27T06:30:22Z">
-        <w:r>
-          <w:rPr>
-            <w:sz w:val="28"/>
-          </w:rPr>
-          <w:delText xml:space="preserve"> “Available to install” (người dùng tự cài);</w:delText>
-        </w:r>
-      </w:del>
-      <w:ins w:id="1017" w:author="Tiếp thu thẩm định lần 2 (Claude)" w:date="2026-09-27T06:30:22Z">
-        <w:r>
-          <w:rPr>
-            <w:sz w:val="28"/>
-          </w:rPr>
-          <w:t xml:space="preserve">đặt chế độ “Available to install” (người dùng tự cài; chế độ này chỉ giới hạn phạm vi phân phối, không phải nghiệm thu);</w:t>
-        </w:r>
-      </w:ins>
-      <w:r>
-        <w:rPr>
-          <w:sz w:val="28"/>
-        </w:rPr>
-        <w:t xml:space="preserve"> </w:t>
-      </w:r>
-      <w:r>
-        <w:rPr>
-          <w:sz w:val="28"/>
-        </w:rPr>
-        <w:t xml:space="preserve">sau khi nghiệm thu (đạt kiểm thử trên cả 3 nền tảng và ít nhất 01 kỳ vận hành thí điểm) mới chuyển</w:t>
-      </w:r>
-      <w:r>
-        <w:rPr>
-          <w:sz w:val="28"/>
-        </w:rPr>
-        <w:t xml:space="preserve"> “Installed by default” (cài sẵn cho mọi tài khoản) hoặc “Required” (bắt buộc) theo quyết định của Hiệu trưởng.</w:t>
+        <w:t>a) Cài ở cấp tổ chức (Hệ thống Claude AI Team của Trường): Phòng QLKHCN&amp;HTPT, bằng tài khoản Chủ sở hữu (Owner), tải tệp plugin tại mục Organization settings &gt; Plugins &amp; skills &gt; Marketplaces &gt; Add &gt; Upload a plugin; sau đó đặt chế độ phân phối tại mục Inventory &gt; Default access. Giai đoạn thí điểm (Phòng TH-HC&amp;QT và các đơn vị do Hiệu trưởng chỉ định, từ kỳ báo cáo tháng 10/2026) đặt chế độ “Available to install” (người dùng tự cài; chế độ này chỉ giới hạn phạm vi phân phối, không phải nghiệm thu); sau khi nghiệm thu (đạt kiểm thử trên cả 3 nền tảng và ít nhất 01 kỳ vận hành thí điểm) mới chuyển “Installed by default” (cài sẵn cho mọi tài khoản) hoặc “Required” (bắt buộc) theo quyết định của Hiệu trưởng.</w:t>
       </w:r>
     </w:p>
     <w:p>
@@ -1323,44 +1086,12 @@
           <w:sz w:val="28"/>
         </w:rPr>
       </w:pPr>
-      <w:del w:id="1036" w:author="Rà soát 897 vòng 1 (Claude)" w:date="2026-09-27T06:30:22Z">
-        <w:r>
-          <w:rPr>
-            <w:sz w:val="28"/>
-          </w:rPr>
-          <w:delText xml:space="preserve">d) Cài phụ trên nền tảng khác (ChatGPT, Gemini)</w:delText>
-        </w:r>
-      </w:del>
-      <w:ins w:id="1037" w:author="Rà soát 897 vòng 1 (Claude)" w:date="2026-09-27T06:30:22Z">
-        <w:r>
-          <w:rPr>
-            <w:sz w:val="28"/>
-          </w:rPr>
-          <w:t xml:space="preserve">d) Sử dụng trên nền tảng khác (ChatGPT, Gemini)</w:t>
-        </w:r>
-      </w:ins>
       <w:r>
         <w:rPr>
           <w:sz w:val="28"/>
         </w:rPr>
-        <w:t xml:space="preserve">: chỉ nạp được phần kỹ năng (SKILL.md và tài liệu kèm theo), không có tác tử kiểm tra và thao tác tự động; chỉ dùng để đối chiếu chéo, </w:t>
+        <w:t>d) Sử dụng trên nền tảng khác (ChatGPT, Gemini): chỉ nạp được phần kỹ năng (SKILL.md và tài liệu kèm theo), không có tác tử kiểm tra và thao tác tự động; chỉ dùng để đối chiếu chéo, không thay thế kết quả trên Claude; tuân thủ yêu cầu bảo mật dữ liệu tại phần Lưu ý Mục II Thông báo này.</w:t>
       </w:r>
-      <w:del w:id="1038" w:author="Rà soát 897 vòng 1 (Claude)" w:date="2026-09-27T06:30:22Z">
-        <w:r>
-          <w:rPr>
-            <w:sz w:val="28"/>
-          </w:rPr>
-          <w:delText xml:space="preserve">không thay thế kết quả trên Claude.</w:delText>
-        </w:r>
-      </w:del>
-      <w:ins w:id="1039" w:author="Rà soát 897 vòng 1 (Claude)" w:date="2026-09-27T06:30:22Z">
-        <w:r>
-          <w:rPr>
-            <w:sz w:val="28"/>
-          </w:rPr>
-          <w:t xml:space="preserve">không thay thế kết quả trên Claude; tuân thủ yêu cầu bảo mật dữ liệu tại phần Lưu ý Mục II Thông báo này.</w:t>
-        </w:r>
-      </w:ins>
     </w:p>
     <w:p>
       <w:pPr>
@@ -1386,46 +1117,7 @@
           <w:sz w:val="28"/>
           <w:szCs w:val="28"/>
         </w:rPr>
-        <w:t xml:space="preserve">Khi cập nhật phiên bản mới, phải gỡ bản cũ trước rồi mới tải bản mới, sau đó mở cuộc hội thoại mới; </w:t>
-      </w:r>
-      <w:r>
-        <w:rPr>
-          <w:sz w:val="28"/>
-          <w:szCs w:val="28"/>
-        </w:rPr>
-        <w:t xml:space="preserve">không để song song nhiều phiên bản; trường hợp phiên bản mới phát sinh lỗi, gỡ phiên bản đó, cài lại phiên bản liền trước do Phòng TH-HC&amp;QT lưu giữ và báo Phòng TH-HC&amp;QT.</w:t>
-      </w:r>
-      <w:r>
-        <w:rPr>
-          <w:sz w:val="28"/>
-          <w:szCs w:val="28"/>
-        </w:rPr>
-        <w:t xml:space="preserve"> </w:t>
-      </w:r>
-      <w:del w:id="1018" w:author="Tiếp thu thẩm định lần 2 (Claude)" w:date="2026-09-27T06:30:22Z">
-        <w:r>
-          <w:rPr>
-            <w:sz w:val="28"/>
-            <w:szCs w:val="28"/>
-          </w:rPr>
-          <w:delText xml:space="preserve">Các bước chi tiết tại Tài liệu hướng dẫn</w:delText>
-        </w:r>
-      </w:del>
-      <w:ins w:id="1019" w:author="Tiếp thu thẩm định lần 2 (Claude)" w:date="2026-09-27T06:30:22Z">
-        <w:r>
-          <w:rPr>
-            <w:sz w:val="28"/>
-            <w:szCs w:val="28"/>
-          </w:rPr>
-          <w:t xml:space="preserve">Chỉ cài tệp do Phòng TH-HC&amp;QT công bố và đối chiếu mã SHA-256 trước khi cài; không cài plugin, kỹ năng từ nguồn khác. Biện pháp chặn ghi, xóa kho dữ liệu và chế độ nhật ký mặc định không ghi nội dung lời nhắn chỉ có từ plugin KTC-Quan-tri phiên bản 1.3.0 (mã SHA-256 do Phòng TH-HC&amp;QT công bố kèm ghi chú phát hành); không cài đặt, không phân phối phiên bản 1.2.1 trở về trước. Các bước chi tiết tại Tài liệu hướng dẫn</w:t>
-        </w:r>
-      </w:ins>
-      <w:r>
-        <w:rPr>
-          <w:sz w:val="28"/>
-          <w:szCs w:val="28"/>
-        </w:rPr>
-        <w:t xml:space="preserve"> sử dụng chi tiết Bộ công cụ KTC-Quan-tri kèm theo Thông báo này.</w:t>
+        <w:t>Khi cập nhật phiên bản mới, phải gỡ bản cũ trước rồi mới tải bản mới, sau đó mở cuộc hội thoại mới; không để song song nhiều phiên bản; trường hợp phiên bản mới phát sinh lỗi, gỡ phiên bản đó, cài lại phiên bản liền trước do Phòng TH-HC&amp;QT lưu giữ và báo Phòng TH-HC&amp;QT. Chỉ cài tệp do Phòng TH-HC&amp;QT công bố và đối chiếu mã SHA-256 trước khi cài; không cài plugin, kỹ năng từ nguồn khác. Biện pháp chặn ghi, xóa kho dữ liệu và chế độ nhật ký mặc định không ghi nội dung lời nhắn chỉ có từ plugin KTC-Quan-tri phiên bản 1.3.0 (mã SHA-256 do Phòng TH-HC&amp;QT công bố kèm ghi chú phát hành); không cài đặt, không phân phối phiên bản 1.2.1 trở về trước. Các bước chi tiết tại Tài liệu hướng dẫn sử dụng chi tiết Bộ công cụ KTC-Quan-tri kèm theo Thông báo này.</w:t>
       </w:r>
     </w:p>
     <w:p>
@@ -1967,32 +1659,7 @@
           <w:sz w:val="28"/>
           <w:szCs w:val="28"/>
         </w:rPr>
-        <w:t xml:space="preserve">Kế hoạch, báo cáo và văn bản do Bộ công cụ hỗ trợ soạn thảo phải được rà soát </w:t>
-      </w:r>
-      <w:del w:id="1028" w:author="Rà soát 897 vòng 2 (Claude)" w:date="2026-09-27T06:30:22Z">
-        <w:r>
-          <w:rPr>
-            <w:sz w:val="28"/>
-            <w:szCs w:val="28"/>
-          </w:rPr>
-          <w:delText xml:space="preserve">bằng công cụ KTC-Ra-Soat-897-v2-Cai-tien theo Thông báo số 948/TB-CĐKT</w:delText>
-        </w:r>
-      </w:del>
-      <w:ins w:id="1029" w:author="Rà soát 897 vòng 2 (Claude)" w:date="2026-09-27T06:30:22Z">
-        <w:r>
-          <w:rPr>
-            <w:sz w:val="28"/>
-            <w:szCs w:val="28"/>
-          </w:rPr>
-          <w:t xml:space="preserve">bằng Skill “ktc-ra-soat-897” theo Thông báo số 948/TB-CĐKT</w:t>
-        </w:r>
-      </w:ins>
-      <w:r>
-        <w:rPr>
-          <w:sz w:val="28"/>
-          <w:szCs w:val="28"/>
-        </w:rPr>
-        <w:t xml:space="preserve">; còn vấn đề Mức 1 thì chưa trình ký.</w:t>
+        <w:t>Kế hoạch, báo cáo và văn bản do Bộ công cụ hỗ trợ soạn thảo phải được rà soát bằng Skill “ktc-ra-soat-897” theo Thông báo số 948/TB-CĐKT; còn vấn đề Mức 1 thì chưa trình ký.</w:t>
       </w:r>
     </w:p>
     <w:p>
@@ -2019,53 +1686,7 @@
           <w:sz w:val="28"/>
           <w:szCs w:val="28"/>
         </w:rPr>
-        <w:t xml:space="preserve">Kết quả do AI tạo ra chỉ có giá trị tham khảo; đơn vị, người soạn thảo và Lãnh đạo đơn vị kiểm tra, chịu trách nhiệm về số liệu, nội dung trước khi gửi, trình. </w:t>
-      </w:r>
-      <w:r>
-        <w:rPr>
-          <w:sz w:val="28"/>
-          <w:szCs w:val="28"/>
-        </w:rPr>
-        <w:t xml:space="preserve">Không đưa thông tin thuộc bí mật nhà nước, tài liệu có dấu mật, mật khẩu, số định danh cá nhân vào nền tảng AI</w:t>
-      </w:r>
-      <w:r>
-        <w:rPr>
-          <w:sz w:val="28"/>
-          <w:szCs w:val="28"/>
-        </w:rPr>
-        <w:t xml:space="preserve">; </w:t>
-      </w:r>
-      <w:del w:id="1020" w:author="Tiếp thu thẩm định lần 2 (Claude)" w:date="2026-09-27T06:30:22Z">
-        <w:r>
-          <w:rPr>
-            <w:sz w:val="28"/>
-            <w:szCs w:val="28"/>
-          </w:rPr>
-          <w:delText xml:space="preserve">dữ liệu cá nhân (họ tên, điểm, nhận xét đánh giá) chỉ xử lý trong phạm vi cần thiết,</w:delText>
-        </w:r>
-      </w:del>
-      <w:ins w:id="1021" w:author="Tiếp thu thẩm định lần 2 (Claude)" w:date="2026-09-27T06:30:22Z">
-        <w:r>
-          <w:rPr>
-            <w:sz w:val="28"/>
-            <w:szCs w:val="28"/>
-          </w:rPr>
-          <w:t xml:space="preserve">dữ liệu cá nhân (họ tên, điểm, nhận xét đánh giá) chỉ do người được đánh giá và người có thẩm quyền xử lý, trong phạm vi cần thiết,</w:t>
-        </w:r>
-      </w:ins>
-      <w:r>
-        <w:rPr>
-          <w:sz w:val="28"/>
-          <w:szCs w:val="28"/>
-        </w:rPr>
-        <w:t xml:space="preserve"> </w:t>
-      </w:r>
-      <w:r>
-        <w:rPr>
-          <w:sz w:val="28"/>
-          <w:szCs w:val="28"/>
-        </w:rPr>
-        <w:t xml:space="preserve">theo quy định của pháp luật về bảo vệ dữ liệu cá nhân. Khi nghi ngờ lộ, lọt dữ liệu hoặc Bộ công cụ cho kết quả bất thường (sai số liệu, ghi đè tệp gốc), người dùng dừng sử dụng và báo ngay Phòng TH-HC&amp;QT.</w:t>
+        <w:t>Kết quả do AI tạo ra chỉ có giá trị tham khảo; đơn vị, người soạn thảo và Lãnh đạo đơn vị kiểm tra, chịu trách nhiệm về số liệu, nội dung trước khi gửi, trình. Không đưa thông tin thuộc bí mật nhà nước, tài liệu có dấu mật, mật khẩu, số định danh cá nhân vào nền tảng AI; dữ liệu cá nhân (họ tên, điểm, nhận xét đánh giá) chỉ do người được đánh giá và người có thẩm quyền xử lý, trong phạm vi cần thiết, theo quy định của pháp luật về bảo vệ dữ liệu cá nhân. Khi nghi ngờ lộ, lọt dữ liệu hoặc Bộ công cụ cho kết quả bất thường (sai số liệu, ghi đè tệp gốc), người dùng dừng sử dụng và báo ngay Phòng TH-HC&amp;QT.</w:t>
       </w:r>
     </w:p>
     <w:p>
@@ -2172,7 +1793,7 @@
         <w:rPr>
           <w:sz w:val="28"/>
         </w:rPr>
-        <w:t xml:space="preserve">d) Tổ chức thí điểm, kiểm thử Bộ công cụ trên 3 nền tảng trước khi áp dụng rộng; lưu giữ phiên bản liền trước để khôi phục khi cần; tạm dừng phân phối phiên bản khi phát hiện lỗi làm sai lệch số liệu, lộ, lọt dữ liệu hoặc ghi đè dữ liệu gốc và báo cáo Lãnh đạo Trường.</w:t>
+        <w:t>d) Tổ chức thí điểm, kiểm thử Bộ công cụ trên 3 nền tảng trước khi áp dụng rộng; lưu giữ phiên bản liền trước để khôi phục khi cần; tạm dừng phân phối phiên bản khi phát hiện lỗi làm sai lệch số liệu, lộ, lọt dữ liệu hoặc ghi đè dữ liệu gốc và báo cáo Lãnh đạo Trường.</w:t>
       </w:r>
     </w:p>
     <w:p>
@@ -2209,26 +1830,8 @@
           <w:sz w:val="28"/>
           <w:szCs w:val="28"/>
         </w:rPr>
-        <w:t xml:space="preserve">Quản trị Hệ thống Claude AI Team của Trường; nạp, cập nhật, đặt chế độ phân phối Bộ công cụ ở cấp tổ chức </w:t>
+        <w:t>Quản trị Hệ thống Claude AI Team của Trường; nạp, cập nhật, đặt chế độ phân phối Bộ công cụ ở cấp tổ chức theo Thông báo số 1056/TB-CĐKT; chỉ nạp tệp đã đối chiếu mã SHA-256; trước khi thí điểm, kiểm kê các phiên bản plugin, kỹ năng KTC đang có ở cấp tổ chức, chuyển các phiên bản cũ sang chế độ “Not available” và lập biên bản kiểm kê.</w:t>
       </w:r>
-      <w:del w:id="1022" w:author="Tiếp thu thẩm định lần 2 (Claude)" w:date="2026-09-27T06:30:22Z">
-        <w:r>
-          <w:rPr>
-            <w:sz w:val="28"/>
-            <w:szCs w:val="28"/>
-          </w:rPr>
-          <w:delText xml:space="preserve">theo Thông báo số 1056/TB-CĐKT ngày 16 tháng 9 năm 2026.</w:delText>
-        </w:r>
-      </w:del>
-      <w:ins w:id="1023" w:author="Tiếp thu thẩm định lần 2 (Claude)" w:date="2026-09-27T06:30:22Z">
-        <w:r>
-          <w:rPr>
-            <w:sz w:val="28"/>
-            <w:szCs w:val="28"/>
-          </w:rPr>
-          <w:t xml:space="preserve">theo Thông báo số 1056/TB-CĐKT; chỉ nạp tệp đã đối chiếu mã SHA-256; trước khi thí điểm, kiểm kê các phiên bản plugin, kỹ năng KTC đang có ở cấp tổ chức, chuyển các phiên bản cũ sang chế độ “Not available” và lập biên bản kiểm kê.</w:t>
-        </w:r>
-      </w:ins>
     </w:p>
     <w:p>
       <w:pPr>
@@ -2264,26 +1867,8 @@
           <w:sz w:val="28"/>
           <w:szCs w:val="28"/>
         </w:rPr>
-        <w:t xml:space="preserve">Hướng dẫn, giải đáp các nội dung đánh giá, xếp loại theo Quyết định số 1923/QĐ-CĐKT </w:t>
+        <w:t>Hướng dẫn, giải đáp các nội dung đánh giá, xếp loại theo Quyết định số 1923/QĐ-CĐKT làm cơ sở cập nhật chức năng KPI cá nhân của Bộ công cụ; cử đại diện tham gia kiểm thử nghiệm thu chức năng KPI cá nhân.</w:t>
       </w:r>
-      <w:del w:id="1024" w:author="Tiếp thu thẩm định lần 2 (Claude)" w:date="2026-09-27T06:30:22Z">
-        <w:r>
-          <w:rPr>
-            <w:sz w:val="28"/>
-            <w:szCs w:val="28"/>
-          </w:rPr>
-          <w:delText xml:space="preserve">làm cơ sở cập nhật chức năng KPI cá nhân của Bộ công cụ.</w:delText>
-        </w:r>
-      </w:del>
-      <w:ins w:id="1025" w:author="Tiếp thu thẩm định lần 2 (Claude)" w:date="2026-09-27T06:30:22Z">
-        <w:r>
-          <w:rPr>
-            <w:sz w:val="28"/>
-            <w:szCs w:val="28"/>
-          </w:rPr>
-          <w:t xml:space="preserve">làm cơ sở cập nhật chức năng KPI cá nhân của Bộ công cụ; cử đại diện tham gia kiểm thử nghiệm thu chức năng KPI cá nhân.</w:t>
-        </w:r>
-      </w:ins>
     </w:p>
     <w:p>
       <w:pPr>
@@ -2498,67 +2083,33 @@
                 <w:lang w:val="vi-VN"/>
               </w:rPr>
             </w:pPr>
-            <w:del w:id="1042" w:author="Rà soát 897 vòng 2 (Claude)" w:date="2026-09-27T06:30:22Z">
-              <w:r>
-                <w:rPr>
-                  <w:sz w:val="22"/>
-                  <w:szCs w:val="22"/>
-                  <w:lang w:val="vi-VN"/>
-                </w:rPr>
-                <w:delText xml:space="preserve">- Đoàn </w:delText>
-              </w:r>
-            </w:del>
-            <w:del w:id="1043" w:author="Rà soát 897 vòng 2 (Claude)" w:date="2026-09-27T06:30:22Z">
-              <w:r>
-                <w:rPr>
-                  <w:sz w:val="22"/>
-                  <w:szCs w:val="22"/>
-                </w:rPr>
-                <w:delText xml:space="preserve">TN </w:delText>
-              </w:r>
-            </w:del>
-            <w:del w:id="1044" w:author="Rà soát 897 vòng 2 (Claude)" w:date="2026-09-27T06:30:22Z">
-              <w:r>
-                <w:rPr>
-                  <w:sz w:val="22"/>
-                  <w:szCs w:val="22"/>
-                  <w:lang w:val="vi-VN"/>
-                </w:rPr>
-                <w:delText>– Hội SV Trường;</w:delText>
-              </w:r>
-            </w:del>
-            <w:ins w:id="1045" w:author="Rà soát 897 vòng 2 (Claude)" w:date="2026-09-27T06:30:22Z">
-              <w:r>
-                <w:rPr>
-                  <w:sz w:val="22"/>
-                  <w:szCs w:val="22"/>
-                  <w:lang w:val="vi-VN"/>
-                </w:rPr>
-                <w:t xml:space="preserve">- Đoàn Trường;</w:t>
-              </w:r>
-            </w:ins>
+            <w:r>
+              <w:rPr>
+                <w:sz w:val="22"/>
+                <w:szCs w:val="22"/>
+                <w:lang w:val="vi-VN"/>
+              </w:rPr>
+              <w:t>- Đoàn Trường;</w:t>
+            </w:r>
           </w:p>
           <w:p>
             <w:pPr>
               <w:widowControl w:val="0"/>
               <w:jc w:val="both"/>
               <w:rPr>
-                <w:ins w:id="1035" w:author="Rà soát 897 vòng 2 (Claude)" w:date="2026-09-27T06:30:22Z"/>
                 <w:sz w:val="22"/>
                 <w:szCs w:val="22"/>
                 <w:lang w:val="vi-VN"/>
               </w:rPr>
             </w:pPr>
-            <w:ins w:id="1034" w:author="Rà soát 897 vòng 2 (Claude)" w:date="2026-09-27T06:30:22Z">
-              <w:r>
-                <w:rPr>
-                  <w:sz w:val="22"/>
-                  <w:szCs w:val="22"/>
-                  <w:lang w:val="vi-VN"/>
-                </w:rPr>
-                <w:t xml:space="preserve">- Hội Sinh viên Trường;</w:t>
-              </w:r>
-            </w:ins>
+            <w:r>
+              <w:rPr>
+                <w:sz w:val="22"/>
+                <w:szCs w:val="22"/>
+                <w:lang w:val="vi-VN"/>
+              </w:rPr>
+              <w:t>- Hội Sinh viên Trường;</w:t>
+            </w:r>
           </w:p>
           <w:p>
             <w:pPr>
@@ -2804,7 +2355,7 @@
 </file>
 
 <file path=word/endnotes.xml><?xml version="1.0" encoding="utf-8"?>
-<w:endnotes xmlns:wpc="http://schemas.microsoft.com/office/word/2010/wordprocessingCanvas" xmlns:cx="http://schemas.microsoft.com/office/drawing/2014/chartex" xmlns:cx1="http://schemas.microsoft.com/office/drawing/2015/9/8/chartex" xmlns:cx2="http://schemas.microsoft.com/office/drawing/2015/10/21/chartex" xmlns:cx3="http://schemas.microsoft.com/office/drawing/2016/5/9/chartex" xmlns:cx4="http://schemas.microsoft.com/office/drawing/2016/5/10/chartex" xmlns:cx5="http://schemas.microsoft.com/office/drawing/2016/5/11/chartex" xmlns:cx6="http://schemas.microsoft.com/office/drawing/2016/5/12/chartex" xmlns:cx7="http://schemas.microsoft.com/office/drawing/2016/5/13/chartex" xmlns:cx8="http://schemas.microsoft.com/office/drawing/2016/5/14/chartex" xmlns:mc="http://schemas.openxmlformats.org/markup-compatibility/2006" xmlns:aink="http://schemas.microsoft.com/office/drawing/2016/ink" xmlns:am3d="http://schemas.microsoft.com/office/drawing/2017/model3d" xmlns:o="urn:schemas-microsoft-com:office:office" xmlns:oel="http://schemas.microsoft.com/office/2019/extlst" xmlns:r="http://schemas.openxmlformats.org/officeDocument/2006/relationships" xmlns:m="http://schemas.openxmlformats.org/officeDocument/2006/math" xmlns:v="urn:schemas-microsoft-com:vml" xmlns:wp14="http://schemas.microsoft.com/office/word/2010/wordprocessingDrawing" xmlns:wp="http://schemas.openxmlformats.org/drawingml/2006/wordprocessingDrawing" xmlns:w10="urn:schemas-microsoft-com:office:word" xmlns:w="http://schemas.openxmlformats.org/wordprocessingml/2006/main" xmlns:w14="http://schemas.microsoft.com/office/word/2010/wordml" xmlns:w15="http://schemas.microsoft.com/office/word/2012/wordml" xmlns:w16cei="http://schemas.microsoft.com/office/word/2026/wordml/cei" xmlns:w16cex="http://schemas.microsoft.com/office/word/2018/wordml/cex" xmlns:w16cid="http://schemas.microsoft.com/office/word/2016/wordml/cid" xmlns:w16="http://schemas.microsoft.com/office/word/2018/wordml" xmlns:w16du="http://schemas.microsoft.com/office/word/2023/wordml/word16du" xmlns:w16sdtdh="http://schemas.microsoft.com/office/word/2020/wordml/sdtdatahash" xmlns:w16sdtfl="http://schemas.microsoft.com/office/word/2024/wordml/sdtformatlock" xmlns:w16se="http://schemas.microsoft.com/office/word/2015/wordml/symex" xmlns:wpg="http://schemas.microsoft.com/office/word/2010/wordprocessingGroup" xmlns:wpi="http://schemas.microsoft.com/office/word/2010/wordprocessingInk" xmlns:wne="http://schemas.microsoft.com/office/word/2006/wordml" xmlns:wps="http://schemas.microsoft.com/office/word/2010/wordprocessingShape" mc:Ignorable="w14 w15 w16se w16cid w16 w16cex w16sdtdh w16sdtfl w16du wp14">
+<w:endnotes xmlns:wpc="http://schemas.microsoft.com/office/word/2010/wordprocessingCanvas" xmlns:cx="http://schemas.microsoft.com/office/drawing/2014/chartex" xmlns:cx1="http://schemas.microsoft.com/office/drawing/2015/9/8/chartex" xmlns:cx2="http://schemas.microsoft.com/office/drawing/2015/10/21/chartex" xmlns:cx3="http://schemas.microsoft.com/office/drawing/2016/5/9/chartex" xmlns:cx4="http://schemas.microsoft.com/office/drawing/2016/5/10/chartex" xmlns:cx5="http://schemas.microsoft.com/office/drawing/2016/5/11/chartex" xmlns:cx6="http://schemas.microsoft.com/office/drawing/2016/5/12/chartex" xmlns:cx7="http://schemas.microsoft.com/office/drawing/2016/5/13/chartex" xmlns:cx8="http://schemas.microsoft.com/office/drawing/2016/5/14/chartex" xmlns:mc="http://schemas.openxmlformats.org/markup-compatibility/2006" xmlns:aink="http://schemas.microsoft.com/office/drawing/2016/ink" xmlns:am3d="http://schemas.microsoft.com/office/drawing/2017/model3d" xmlns:o="urn:schemas-microsoft-com:office:office" xmlns:oel="http://schemas.microsoft.com/office/2019/extlst" xmlns:r="http://schemas.openxmlformats.org/officeDocument/2006/relationships" xmlns:m="http://schemas.openxmlformats.org/officeDocument/2006/math" xmlns:v="urn:schemas-microsoft-com:vml" xmlns:wp14="http://schemas.microsoft.com/office/word/2010/wordprocessingDrawing" xmlns:wp="http://schemas.openxmlformats.org/drawingml/2006/wordprocessingDrawing" xmlns:w10="urn:schemas-microsoft-com:office:word" xmlns:w="http://schemas.openxmlformats.org/wordprocessingml/2006/main" xmlns:w14="http://schemas.microsoft.com/office/word/2010/wordml" xmlns:w15="http://schemas.microsoft.com/office/word/2012/wordml" xmlns:w16cex="http://schemas.microsoft.com/office/word/2018/wordml/cex" xmlns:w16cid="http://schemas.microsoft.com/office/word/2016/wordml/cid" xmlns:w16="http://schemas.microsoft.com/office/word/2018/wordml" xmlns:w16du="http://schemas.microsoft.com/office/word/2023/wordml/word16du" xmlns:w16sdtdh="http://schemas.microsoft.com/office/word/2020/wordml/sdtdatahash" xmlns:w16se="http://schemas.microsoft.com/office/word/2015/wordml/symex" xmlns:wpg="http://schemas.microsoft.com/office/word/2010/wordprocessingGroup" xmlns:wpi="http://schemas.microsoft.com/office/word/2010/wordprocessingInk" xmlns:wne="http://schemas.microsoft.com/office/word/2006/wordml" xmlns:wps="http://schemas.microsoft.com/office/word/2010/wordprocessingShape" mc:Ignorable="w14 w15 w16se w16cid w16 w16cex w16sdtdh wp14">
   <w:endnote w:type="separator" w:id="-1">
     <w:p>
       <w:r>
@@ -2823,7 +2374,7 @@
 </file>
 
 <file path=word/footer1.xml><?xml version="1.0" encoding="utf-8"?>
-<w:ftr xmlns:wpc="http://schemas.microsoft.com/office/word/2010/wordprocessingCanvas" xmlns:cx="http://schemas.microsoft.com/office/drawing/2014/chartex" xmlns:cx1="http://schemas.microsoft.com/office/drawing/2015/9/8/chartex" xmlns:cx2="http://schemas.microsoft.com/office/drawing/2015/10/21/chartex" xmlns:cx3="http://schemas.microsoft.com/office/drawing/2016/5/9/chartex" xmlns:cx4="http://schemas.microsoft.com/office/drawing/2016/5/10/chartex" xmlns:cx5="http://schemas.microsoft.com/office/drawing/2016/5/11/chartex" xmlns:cx6="http://schemas.microsoft.com/office/drawing/2016/5/12/chartex" xmlns:cx7="http://schemas.microsoft.com/office/drawing/2016/5/13/chartex" xmlns:cx8="http://schemas.microsoft.com/office/drawing/2016/5/14/chartex" xmlns:mc="http://schemas.openxmlformats.org/markup-compatibility/2006" xmlns:aink="http://schemas.microsoft.com/office/drawing/2016/ink" xmlns:am3d="http://schemas.microsoft.com/office/drawing/2017/model3d" xmlns:o="urn:schemas-microsoft-com:office:office" xmlns:oel="http://schemas.microsoft.com/office/2019/extlst" xmlns:r="http://schemas.openxmlformats.org/officeDocument/2006/relationships" xmlns:m="http://schemas.openxmlformats.org/officeDocument/2006/math" xmlns:v="urn:schemas-microsoft-com:vml" xmlns:wp14="http://schemas.microsoft.com/office/word/2010/wordprocessingDrawing" xmlns:wp="http://schemas.openxmlformats.org/drawingml/2006/wordprocessingDrawing" xmlns:w10="urn:schemas-microsoft-com:office:word" xmlns:w="http://schemas.openxmlformats.org/wordprocessingml/2006/main" xmlns:w14="http://schemas.microsoft.com/office/word/2010/wordml" xmlns:w15="http://schemas.microsoft.com/office/word/2012/wordml" xmlns:w16cei="http://schemas.microsoft.com/office/word/2026/wordml/cei" xmlns:w16cex="http://schemas.microsoft.com/office/word/2018/wordml/cex" xmlns:w16cid="http://schemas.microsoft.com/office/word/2016/wordml/cid" xmlns:w16="http://schemas.microsoft.com/office/word/2018/wordml" xmlns:w16du="http://schemas.microsoft.com/office/word/2023/wordml/word16du" xmlns:w16sdtdh="http://schemas.microsoft.com/office/word/2020/wordml/sdtdatahash" xmlns:w16sdtfl="http://schemas.microsoft.com/office/word/2024/wordml/sdtformatlock" xmlns:w16se="http://schemas.microsoft.com/office/word/2015/wordml/symex" xmlns:wpg="http://schemas.microsoft.com/office/word/2010/wordprocessingGroup" xmlns:wpi="http://schemas.microsoft.com/office/word/2010/wordprocessingInk" xmlns:wne="http://schemas.microsoft.com/office/word/2006/wordml" xmlns:wps="http://schemas.microsoft.com/office/word/2010/wordprocessingShape" mc:Ignorable="w14 w15 w16se w16cid w16 w16cex w16sdtdh w16sdtfl w16du wp14">
+<w:ftr xmlns:wpc="http://schemas.microsoft.com/office/word/2010/wordprocessingCanvas" xmlns:cx="http://schemas.microsoft.com/office/drawing/2014/chartex" xmlns:cx1="http://schemas.microsoft.com/office/drawing/2015/9/8/chartex" xmlns:cx2="http://schemas.microsoft.com/office/drawing/2015/10/21/chartex" xmlns:cx3="http://schemas.microsoft.com/office/drawing/2016/5/9/chartex" xmlns:cx4="http://schemas.microsoft.com/office/drawing/2016/5/10/chartex" xmlns:cx5="http://schemas.microsoft.com/office/drawing/2016/5/11/chartex" xmlns:cx6="http://schemas.microsoft.com/office/drawing/2016/5/12/chartex" xmlns:cx7="http://schemas.microsoft.com/office/drawing/2016/5/13/chartex" xmlns:cx8="http://schemas.microsoft.com/office/drawing/2016/5/14/chartex" xmlns:mc="http://schemas.openxmlformats.org/markup-compatibility/2006" xmlns:aink="http://schemas.microsoft.com/office/drawing/2016/ink" xmlns:am3d="http://schemas.microsoft.com/office/drawing/2017/model3d" xmlns:o="urn:schemas-microsoft-com:office:office" xmlns:oel="http://schemas.microsoft.com/office/2019/extlst" xmlns:r="http://schemas.openxmlformats.org/officeDocument/2006/relationships" xmlns:m="http://schemas.openxmlformats.org/officeDocument/2006/math" xmlns:v="urn:schemas-microsoft-com:vml" xmlns:wp14="http://schemas.microsoft.com/office/word/2010/wordprocessingDrawing" xmlns:wp="http://schemas.openxmlformats.org/drawingml/2006/wordprocessingDrawing" xmlns:w10="urn:schemas-microsoft-com:office:word" xmlns:w="http://schemas.openxmlformats.org/wordprocessingml/2006/main" xmlns:w14="http://schemas.microsoft.com/office/word/2010/wordml" xmlns:w15="http://schemas.microsoft.com/office/word/2012/wordml" xmlns:w16cex="http://schemas.microsoft.com/office/word/2018/wordml/cex" xmlns:w16cid="http://schemas.microsoft.com/office/word/2016/wordml/cid" xmlns:w16="http://schemas.microsoft.com/office/word/2018/wordml" xmlns:w16du="http://schemas.microsoft.com/office/word/2023/wordml/word16du" xmlns:w16sdtdh="http://schemas.microsoft.com/office/word/2020/wordml/sdtdatahash" xmlns:w16se="http://schemas.microsoft.com/office/word/2015/wordml/symex" xmlns:wpg="http://schemas.microsoft.com/office/word/2010/wordprocessingGroup" xmlns:wpi="http://schemas.microsoft.com/office/word/2010/wordprocessingInk" xmlns:wne="http://schemas.microsoft.com/office/word/2006/wordml" xmlns:wps="http://schemas.microsoft.com/office/word/2010/wordprocessingShape" mc:Ignorable="w14 w15 w16se w16cid w16 w16cex w16sdtdh wp14">
   <w:p>
     <w:pPr>
       <w:pStyle w:val="Footer"/>
@@ -2860,7 +2411,7 @@
 </file>
 
 <file path=word/footnotes.xml><?xml version="1.0" encoding="utf-8"?>
-<w:footnotes xmlns:wpc="http://schemas.microsoft.com/office/word/2010/wordprocessingCanvas" xmlns:cx="http://schemas.microsoft.com/office/drawing/2014/chartex" xmlns:cx1="http://schemas.microsoft.com/office/drawing/2015/9/8/chartex" xmlns:cx2="http://schemas.microsoft.com/office/drawing/2015/10/21/chartex" xmlns:cx3="http://schemas.microsoft.com/office/drawing/2016/5/9/chartex" xmlns:cx4="http://schemas.microsoft.com/office/drawing/2016/5/10/chartex" xmlns:cx5="http://schemas.microsoft.com/office/drawing/2016/5/11/chartex" xmlns:cx6="http://schemas.microsoft.com/office/drawing/2016/5/12/chartex" xmlns:cx7="http://schemas.microsoft.com/office/drawing/2016/5/13/chartex" xmlns:cx8="http://schemas.microsoft.com/office/drawing/2016/5/14/chartex" xmlns:mc="http://schemas.openxmlformats.org/markup-compatibility/2006" xmlns:aink="http://schemas.microsoft.com/office/drawing/2016/ink" xmlns:am3d="http://schemas.microsoft.com/office/drawing/2017/model3d" xmlns:o="urn:schemas-microsoft-com:office:office" xmlns:oel="http://schemas.microsoft.com/office/2019/extlst" xmlns:r="http://schemas.openxmlformats.org/officeDocument/2006/relationships" xmlns:m="http://schemas.openxmlformats.org/officeDocument/2006/math" xmlns:v="urn:schemas-microsoft-com:vml" xmlns:wp14="http://schemas.microsoft.com/office/word/2010/wordprocessingDrawing" xmlns:wp="http://schemas.openxmlformats.org/drawingml/2006/wordprocessingDrawing" xmlns:w10="urn:schemas-microsoft-com:office:word" xmlns:w="http://schemas.openxmlformats.org/wordprocessingml/2006/main" xmlns:w14="http://schemas.microsoft.com/office/word/2010/wordml" xmlns:w15="http://schemas.microsoft.com/office/word/2012/wordml" xmlns:w16cei="http://schemas.microsoft.com/office/word/2026/wordml/cei" xmlns:w16cex="http://schemas.microsoft.com/office/word/2018/wordml/cex" xmlns:w16cid="http://schemas.microsoft.com/office/word/2016/wordml/cid" xmlns:w16="http://schemas.microsoft.com/office/word/2018/wordml" xmlns:w16du="http://schemas.microsoft.com/office/word/2023/wordml/word16du" xmlns:w16sdtdh="http://schemas.microsoft.com/office/word/2020/wordml/sdtdatahash" xmlns:w16sdtfl="http://schemas.microsoft.com/office/word/2024/wordml/sdtformatlock" xmlns:w16se="http://schemas.microsoft.com/office/word/2015/wordml/symex" xmlns:wpg="http://schemas.microsoft.com/office/word/2010/wordprocessingGroup" xmlns:wpi="http://schemas.microsoft.com/office/word/2010/wordprocessingInk" xmlns:wne="http://schemas.microsoft.com/office/word/2006/wordml" xmlns:wps="http://schemas.microsoft.com/office/word/2010/wordprocessingShape" mc:Ignorable="w14 w15 w16se w16cid w16 w16cex w16sdtdh w16sdtfl w16du wp14">
+<w:footnotes xmlns:wpc="http://schemas.microsoft.com/office/word/2010/wordprocessingCanvas" xmlns:cx="http://schemas.microsoft.com/office/drawing/2014/chartex" xmlns:cx1="http://schemas.microsoft.com/office/drawing/2015/9/8/chartex" xmlns:cx2="http://schemas.microsoft.com/office/drawing/2015/10/21/chartex" xmlns:cx3="http://schemas.microsoft.com/office/drawing/2016/5/9/chartex" xmlns:cx4="http://schemas.microsoft.com/office/drawing/2016/5/10/chartex" xmlns:cx5="http://schemas.microsoft.com/office/drawing/2016/5/11/chartex" xmlns:cx6="http://schemas.microsoft.com/office/drawing/2016/5/12/chartex" xmlns:cx7="http://schemas.microsoft.com/office/drawing/2016/5/13/chartex" xmlns:cx8="http://schemas.microsoft.com/office/drawing/2016/5/14/chartex" xmlns:mc="http://schemas.openxmlformats.org/markup-compatibility/2006" xmlns:aink="http://schemas.microsoft.com/office/drawing/2016/ink" xmlns:am3d="http://schemas.microsoft.com/office/drawing/2017/model3d" xmlns:o="urn:schemas-microsoft-com:office:office" xmlns:oel="http://schemas.microsoft.com/office/2019/extlst" xmlns:r="http://schemas.openxmlformats.org/officeDocument/2006/relationships" xmlns:m="http://schemas.openxmlformats.org/officeDocument/2006/math" xmlns:v="urn:schemas-microsoft-com:vml" xmlns:wp14="http://schemas.microsoft.com/office/word/2010/wordprocessingDrawing" xmlns:wp="http://schemas.openxmlformats.org/drawingml/2006/wordprocessingDrawing" xmlns:w10="urn:schemas-microsoft-com:office:word" xmlns:w="http://schemas.openxmlformats.org/wordprocessingml/2006/main" xmlns:w14="http://schemas.microsoft.com/office/word/2010/wordml" xmlns:w15="http://schemas.microsoft.com/office/word/2012/wordml" xmlns:w16cex="http://schemas.microsoft.com/office/word/2018/wordml/cex" xmlns:w16cid="http://schemas.microsoft.com/office/word/2016/wordml/cid" xmlns:w16="http://schemas.microsoft.com/office/word/2018/wordml" xmlns:w16du="http://schemas.microsoft.com/office/word/2023/wordml/word16du" xmlns:w16sdtdh="http://schemas.microsoft.com/office/word/2020/wordml/sdtdatahash" xmlns:w16se="http://schemas.microsoft.com/office/word/2015/wordml/symex" xmlns:wpg="http://schemas.microsoft.com/office/word/2010/wordprocessingGroup" xmlns:wpi="http://schemas.microsoft.com/office/word/2010/wordprocessingInk" xmlns:wne="http://schemas.microsoft.com/office/word/2006/wordml" xmlns:wps="http://schemas.microsoft.com/office/word/2010/wordprocessingShape" mc:Ignorable="w14 w15 w16se w16cid w16 w16cex w16sdtdh wp14">
   <w:footnote w:type="separator" w:id="-1">
     <w:p>
       <w:r>
@@ -2875,37 +2426,11 @@
       </w:r>
     </w:p>
   </w:footnote>
-  <w:footnote w:id="1">
-    <w:p>
-      <w:pPr>
-        <w:pStyle w:val="FootnoteText"/>
-        <w:rPr>
-          <w:sz w:val="18"/>
-          <w:szCs w:val="18"/>
-        </w:rPr>
-      </w:pPr>
-      <w:r>
-        <w:rPr>
-          <w:rStyle w:val="FootnoteCharacters"/>
-          <w:sz w:val="18"/>
-          <w:szCs w:val="18"/>
-        </w:rPr>
-        <w:footnoteRef/>
-      </w:r>
-      <w:r>
-        <w:rPr>
-          <w:sz w:val="18"/>
-          <w:szCs w:val="18"/>
-        </w:rPr>
-        <w:t xml:space="preserve"> Nhưng cần thực hiện các biện pháp an toàn, bảo mật thông tin; sử dụng tài khoản của đơn vị được Trường phê duyệt; tài khoản miễn phí chỉ được dùng với tài liệu công khai, không nhạy cảm và khi đáp ứng chính sách bảo mật do Trường xác nhận. </w:t>
-      </w:r>
-    </w:p>
-  </w:footnote>
 </w:footnotes>
 </file>
 
 <file path=word/header1.xml><?xml version="1.0" encoding="utf-8"?>
-<w:hdr xmlns:wpc="http://schemas.microsoft.com/office/word/2010/wordprocessingCanvas" xmlns:cx="http://schemas.microsoft.com/office/drawing/2014/chartex" xmlns:cx1="http://schemas.microsoft.com/office/drawing/2015/9/8/chartex" xmlns:cx2="http://schemas.microsoft.com/office/drawing/2015/10/21/chartex" xmlns:cx3="http://schemas.microsoft.com/office/drawing/2016/5/9/chartex" xmlns:cx4="http://schemas.microsoft.com/office/drawing/2016/5/10/chartex" xmlns:cx5="http://schemas.microsoft.com/office/drawing/2016/5/11/chartex" xmlns:cx6="http://schemas.microsoft.com/office/drawing/2016/5/12/chartex" xmlns:cx7="http://schemas.microsoft.com/office/drawing/2016/5/13/chartex" xmlns:cx8="http://schemas.microsoft.com/office/drawing/2016/5/14/chartex" xmlns:mc="http://schemas.openxmlformats.org/markup-compatibility/2006" xmlns:aink="http://schemas.microsoft.com/office/drawing/2016/ink" xmlns:am3d="http://schemas.microsoft.com/office/drawing/2017/model3d" xmlns:o="urn:schemas-microsoft-com:office:office" xmlns:oel="http://schemas.microsoft.com/office/2019/extlst" xmlns:r="http://schemas.openxmlformats.org/officeDocument/2006/relationships" xmlns:m="http://schemas.openxmlformats.org/officeDocument/2006/math" xmlns:v="urn:schemas-microsoft-com:vml" xmlns:wp14="http://schemas.microsoft.com/office/word/2010/wordprocessingDrawing" xmlns:wp="http://schemas.openxmlformats.org/drawingml/2006/wordprocessingDrawing" xmlns:w10="urn:schemas-microsoft-com:office:word" xmlns:w="http://schemas.openxmlformats.org/wordprocessingml/2006/main" xmlns:w14="http://schemas.microsoft.com/office/word/2010/wordml" xmlns:w15="http://schemas.microsoft.com/office/word/2012/wordml" xmlns:w16cei="http://schemas.microsoft.com/office/word/2026/wordml/cei" xmlns:w16cex="http://schemas.microsoft.com/office/word/2018/wordml/cex" xmlns:w16cid="http://schemas.microsoft.com/office/word/2016/wordml/cid" xmlns:w16="http://schemas.microsoft.com/office/word/2018/wordml" xmlns:w16du="http://schemas.microsoft.com/office/word/2023/wordml/word16du" xmlns:w16sdtdh="http://schemas.microsoft.com/office/word/2020/wordml/sdtdatahash" xmlns:w16sdtfl="http://schemas.microsoft.com/office/word/2024/wordml/sdtformatlock" xmlns:w16se="http://schemas.microsoft.com/office/word/2015/wordml/symex" xmlns:wpg="http://schemas.microsoft.com/office/word/2010/wordprocessingGroup" xmlns:wpi="http://schemas.microsoft.com/office/word/2010/wordprocessingInk" xmlns:wne="http://schemas.microsoft.com/office/word/2006/wordml" xmlns:wps="http://schemas.microsoft.com/office/word/2010/wordprocessingShape" mc:Ignorable="w14 w15 w16se w16cid w16 w16cex w16sdtdh w16sdtfl w16du wp14">
+<w:hdr xmlns:wpc="http://schemas.microsoft.com/office/word/2010/wordprocessingCanvas" xmlns:cx="http://schemas.microsoft.com/office/drawing/2014/chartex" xmlns:cx1="http://schemas.microsoft.com/office/drawing/2015/9/8/chartex" xmlns:cx2="http://schemas.microsoft.com/office/drawing/2015/10/21/chartex" xmlns:cx3="http://schemas.microsoft.com/office/drawing/2016/5/9/chartex" xmlns:cx4="http://schemas.microsoft.com/office/drawing/2016/5/10/chartex" xmlns:cx5="http://schemas.microsoft.com/office/drawing/2016/5/11/chartex" xmlns:cx6="http://schemas.microsoft.com/office/drawing/2016/5/12/chartex" xmlns:cx7="http://schemas.microsoft.com/office/drawing/2016/5/13/chartex" xmlns:cx8="http://schemas.microsoft.com/office/drawing/2016/5/14/chartex" xmlns:mc="http://schemas.openxmlformats.org/markup-compatibility/2006" xmlns:aink="http://schemas.microsoft.com/office/drawing/2016/ink" xmlns:am3d="http://schemas.microsoft.com/office/drawing/2017/model3d" xmlns:o="urn:schemas-microsoft-com:office:office" xmlns:oel="http://schemas.microsoft.com/office/2019/extlst" xmlns:r="http://schemas.openxmlformats.org/officeDocument/2006/relationships" xmlns:m="http://schemas.openxmlformats.org/officeDocument/2006/math" xmlns:v="urn:schemas-microsoft-com:vml" xmlns:wp14="http://schemas.microsoft.com/office/word/2010/wordprocessingDrawing" xmlns:wp="http://schemas.openxmlformats.org/drawingml/2006/wordprocessingDrawing" xmlns:w10="urn:schemas-microsoft-com:office:word" xmlns:w="http://schemas.openxmlformats.org/wordprocessingml/2006/main" xmlns:w14="http://schemas.microsoft.com/office/word/2010/wordml" xmlns:w15="http://schemas.microsoft.com/office/word/2012/wordml" xmlns:w16cex="http://schemas.microsoft.com/office/word/2018/wordml/cex" xmlns:w16cid="http://schemas.microsoft.com/office/word/2016/wordml/cid" xmlns:w16="http://schemas.microsoft.com/office/word/2018/wordml" xmlns:w16du="http://schemas.microsoft.com/office/word/2023/wordml/word16du" xmlns:w16sdtdh="http://schemas.microsoft.com/office/word/2020/wordml/sdtdatahash" xmlns:w16se="http://schemas.microsoft.com/office/word/2015/wordml/symex" xmlns:wpg="http://schemas.microsoft.com/office/word/2010/wordprocessingGroup" xmlns:wpi="http://schemas.microsoft.com/office/word/2010/wordprocessingInk" xmlns:wne="http://schemas.microsoft.com/office/word/2006/wordml" xmlns:wps="http://schemas.microsoft.com/office/word/2010/wordprocessingShape" mc:Ignorable="w14 w15 w16se w16cid w16 w16cex w16sdtdh wp14">
   <w:sdt>
     <w:sdtPr>
       <w:id w:val="913905417"/>
@@ -2975,7 +2500,7 @@
 </file>
 
 <file path=word/header2.xml><?xml version="1.0" encoding="utf-8"?>
-<w:hdr xmlns:wpc="http://schemas.microsoft.com/office/word/2010/wordprocessingCanvas" xmlns:cx="http://schemas.microsoft.com/office/drawing/2014/chartex" xmlns:cx1="http://schemas.microsoft.com/office/drawing/2015/9/8/chartex" xmlns:cx2="http://schemas.microsoft.com/office/drawing/2015/10/21/chartex" xmlns:cx3="http://schemas.microsoft.com/office/drawing/2016/5/9/chartex" xmlns:cx4="http://schemas.microsoft.com/office/drawing/2016/5/10/chartex" xmlns:cx5="http://schemas.microsoft.com/office/drawing/2016/5/11/chartex" xmlns:cx6="http://schemas.microsoft.com/office/drawing/2016/5/12/chartex" xmlns:cx7="http://schemas.microsoft.com/office/drawing/2016/5/13/chartex" xmlns:cx8="http://schemas.microsoft.com/office/drawing/2016/5/14/chartex" xmlns:mc="http://schemas.openxmlformats.org/markup-compatibility/2006" xmlns:aink="http://schemas.microsoft.com/office/drawing/2016/ink" xmlns:am3d="http://schemas.microsoft.com/office/drawing/2017/model3d" xmlns:o="urn:schemas-microsoft-com:office:office" xmlns:oel="http://schemas.microsoft.com/office/2019/extlst" xmlns:r="http://schemas.openxmlformats.org/officeDocument/2006/relationships" xmlns:m="http://schemas.openxmlformats.org/officeDocument/2006/math" xmlns:v="urn:schemas-microsoft-com:vml" xmlns:wp14="http://schemas.microsoft.com/office/word/2010/wordprocessingDrawing" xmlns:wp="http://schemas.openxmlformats.org/drawingml/2006/wordprocessingDrawing" xmlns:w10="urn:schemas-microsoft-com:office:word" xmlns:w="http://schemas.openxmlformats.org/wordprocessingml/2006/main" xmlns:w14="http://schemas.microsoft.com/office/word/2010/wordml" xmlns:w15="http://schemas.microsoft.com/office/word/2012/wordml" xmlns:w16cei="http://schemas.microsoft.com/office/word/2026/wordml/cei" xmlns:w16cex="http://schemas.microsoft.com/office/word/2018/wordml/cex" xmlns:w16cid="http://schemas.microsoft.com/office/word/2016/wordml/cid" xmlns:w16="http://schemas.microsoft.com/office/word/2018/wordml" xmlns:w16du="http://schemas.microsoft.com/office/word/2023/wordml/word16du" xmlns:w16sdtdh="http://schemas.microsoft.com/office/word/2020/wordml/sdtdatahash" xmlns:w16sdtfl="http://schemas.microsoft.com/office/word/2024/wordml/sdtformatlock" xmlns:w16se="http://schemas.microsoft.com/office/word/2015/wordml/symex" xmlns:wpg="http://schemas.microsoft.com/office/word/2010/wordprocessingGroup" xmlns:wpi="http://schemas.microsoft.com/office/word/2010/wordprocessingInk" xmlns:wne="http://schemas.microsoft.com/office/word/2006/wordml" xmlns:wps="http://schemas.microsoft.com/office/word/2010/wordprocessingShape" mc:Ignorable="w14 w15 w16se w16cid w16 w16cex w16sdtdh w16sdtfl w16du wp14">
+<w:hdr xmlns:wpc="http://schemas.microsoft.com/office/word/2010/wordprocessingCanvas" xmlns:cx="http://schemas.microsoft.com/office/drawing/2014/chartex" xmlns:cx1="http://schemas.microsoft.com/office/drawing/2015/9/8/chartex" xmlns:cx2="http://schemas.microsoft.com/office/drawing/2015/10/21/chartex" xmlns:cx3="http://schemas.microsoft.com/office/drawing/2016/5/9/chartex" xmlns:cx4="http://schemas.microsoft.com/office/drawing/2016/5/10/chartex" xmlns:cx5="http://schemas.microsoft.com/office/drawing/2016/5/11/chartex" xmlns:cx6="http://schemas.microsoft.com/office/drawing/2016/5/12/chartex" xmlns:cx7="http://schemas.microsoft.com/office/drawing/2016/5/13/chartex" xmlns:cx8="http://schemas.microsoft.com/office/drawing/2016/5/14/chartex" xmlns:mc="http://schemas.openxmlformats.org/markup-compatibility/2006" xmlns:aink="http://schemas.microsoft.com/office/drawing/2016/ink" xmlns:am3d="http://schemas.microsoft.com/office/drawing/2017/model3d" xmlns:o="urn:schemas-microsoft-com:office:office" xmlns:oel="http://schemas.microsoft.com/office/2019/extlst" xmlns:r="http://schemas.openxmlformats.org/officeDocument/2006/relationships" xmlns:m="http://schemas.openxmlformats.org/officeDocument/2006/math" xmlns:v="urn:schemas-microsoft-com:vml" xmlns:wp14="http://schemas.microsoft.com/office/word/2010/wordprocessingDrawing" xmlns:wp="http://schemas.openxmlformats.org/drawingml/2006/wordprocessingDrawing" xmlns:w10="urn:schemas-microsoft-com:office:word" xmlns:w="http://schemas.openxmlformats.org/wordprocessingml/2006/main" xmlns:w14="http://schemas.microsoft.com/office/word/2010/wordml" xmlns:w15="http://schemas.microsoft.com/office/word/2012/wordml" xmlns:w16cex="http://schemas.microsoft.com/office/word/2018/wordml/cex" xmlns:w16cid="http://schemas.microsoft.com/office/word/2016/wordml/cid" xmlns:w16="http://schemas.microsoft.com/office/word/2018/wordml" xmlns:w16du="http://schemas.microsoft.com/office/word/2023/wordml/word16du" xmlns:w16sdtdh="http://schemas.microsoft.com/office/word/2020/wordml/sdtdatahash" xmlns:w16se="http://schemas.microsoft.com/office/word/2015/wordml/symex" xmlns:wpg="http://schemas.microsoft.com/office/word/2010/wordprocessingGroup" xmlns:wpi="http://schemas.microsoft.com/office/word/2010/wordprocessingInk" xmlns:wne="http://schemas.microsoft.com/office/word/2006/wordml" xmlns:wps="http://schemas.microsoft.com/office/word/2010/wordprocessingShape" mc:Ignorable="w14 w15 w16se w16cid w16 w16cex w16sdtdh wp14">
   <w:p>
     <w:pPr>
       <w:pStyle w:val="Header"/>
@@ -2986,7 +2511,7 @@
 </file>
 
 <file path=word/numbering.xml><?xml version="1.0" encoding="utf-8"?>
-<w:numbering xmlns:wpc="http://schemas.microsoft.com/office/word/2010/wordprocessingCanvas" xmlns:cx="http://schemas.microsoft.com/office/drawing/2014/chartex" xmlns:cx1="http://schemas.microsoft.com/office/drawing/2015/9/8/chartex" xmlns:cx2="http://schemas.microsoft.com/office/drawing/2015/10/21/chartex" xmlns:cx3="http://schemas.microsoft.com/office/drawing/2016/5/9/chartex" xmlns:cx4="http://schemas.microsoft.com/office/drawing/2016/5/10/chartex" xmlns:cx5="http://schemas.microsoft.com/office/drawing/2016/5/11/chartex" xmlns:cx6="http://schemas.microsoft.com/office/drawing/2016/5/12/chartex" xmlns:cx7="http://schemas.microsoft.com/office/drawing/2016/5/13/chartex" xmlns:cx8="http://schemas.microsoft.com/office/drawing/2016/5/14/chartex" xmlns:mc="http://schemas.openxmlformats.org/markup-compatibility/2006" xmlns:aink="http://schemas.microsoft.com/office/drawing/2016/ink" xmlns:am3d="http://schemas.microsoft.com/office/drawing/2017/model3d" xmlns:o="urn:schemas-microsoft-com:office:office" xmlns:oel="http://schemas.microsoft.com/office/2019/extlst" xmlns:r="http://schemas.openxmlformats.org/officeDocument/2006/relationships" xmlns:m="http://schemas.openxmlformats.org/officeDocument/2006/math" xmlns:v="urn:schemas-microsoft-com:vml" xmlns:wp14="http://schemas.microsoft.com/office/word/2010/wordprocessingDrawing" xmlns:wp="http://schemas.openxmlformats.org/drawingml/2006/wordprocessingDrawing" xmlns:w10="urn:schemas-microsoft-com:office:word" xmlns:w="http://schemas.openxmlformats.org/wordprocessingml/2006/main" xmlns:w14="http://schemas.microsoft.com/office/word/2010/wordml" xmlns:w15="http://schemas.microsoft.com/office/word/2012/wordml" xmlns:w16cei="http://schemas.microsoft.com/office/word/2026/wordml/cei" xmlns:w16cex="http://schemas.microsoft.com/office/word/2018/wordml/cex" xmlns:w16cid="http://schemas.microsoft.com/office/word/2016/wordml/cid" xmlns:w16="http://schemas.microsoft.com/office/word/2018/wordml" xmlns:w16du="http://schemas.microsoft.com/office/word/2023/wordml/word16du" xmlns:w16sdtdh="http://schemas.microsoft.com/office/word/2020/wordml/sdtdatahash" xmlns:w16sdtfl="http://schemas.microsoft.com/office/word/2024/wordml/sdtformatlock" xmlns:w16se="http://schemas.microsoft.com/office/word/2015/wordml/symex" xmlns:wpg="http://schemas.microsoft.com/office/word/2010/wordprocessingGroup" xmlns:wpi="http://schemas.microsoft.com/office/word/2010/wordprocessingInk" xmlns:wne="http://schemas.microsoft.com/office/word/2006/wordml" xmlns:wps="http://schemas.microsoft.com/office/word/2010/wordprocessingShape" mc:Ignorable="w14 w15 w16se w16cid w16 w16cex w16sdtdh w16sdtfl w16du wp14">
+<w:numbering xmlns:wpc="http://schemas.microsoft.com/office/word/2010/wordprocessingCanvas" xmlns:cx="http://schemas.microsoft.com/office/drawing/2014/chartex" xmlns:cx1="http://schemas.microsoft.com/office/drawing/2015/9/8/chartex" xmlns:cx2="http://schemas.microsoft.com/office/drawing/2015/10/21/chartex" xmlns:cx3="http://schemas.microsoft.com/office/drawing/2016/5/9/chartex" xmlns:cx4="http://schemas.microsoft.com/office/drawing/2016/5/10/chartex" xmlns:cx5="http://schemas.microsoft.com/office/drawing/2016/5/11/chartex" xmlns:cx6="http://schemas.microsoft.com/office/drawing/2016/5/12/chartex" xmlns:cx7="http://schemas.microsoft.com/office/drawing/2016/5/13/chartex" xmlns:cx8="http://schemas.microsoft.com/office/drawing/2016/5/14/chartex" xmlns:mc="http://schemas.openxmlformats.org/markup-compatibility/2006" xmlns:aink="http://schemas.microsoft.com/office/drawing/2016/ink" xmlns:am3d="http://schemas.microsoft.com/office/drawing/2017/model3d" xmlns:o="urn:schemas-microsoft-com:office:office" xmlns:oel="http://schemas.microsoft.com/office/2019/extlst" xmlns:r="http://schemas.openxmlformats.org/officeDocument/2006/relationships" xmlns:m="http://schemas.openxmlformats.org/officeDocument/2006/math" xmlns:v="urn:schemas-microsoft-com:vml" xmlns:wp14="http://schemas.microsoft.com/office/word/2010/wordprocessingDrawing" xmlns:wp="http://schemas.openxmlformats.org/drawingml/2006/wordprocessingDrawing" xmlns:w10="urn:schemas-microsoft-com:office:word" xmlns:w="http://schemas.openxmlformats.org/wordprocessingml/2006/main" xmlns:w14="http://schemas.microsoft.com/office/word/2010/wordml" xmlns:w15="http://schemas.microsoft.com/office/word/2012/wordml" xmlns:w16cex="http://schemas.microsoft.com/office/word/2018/wordml/cex" xmlns:w16cid="http://schemas.microsoft.com/office/word/2016/wordml/cid" xmlns:w16="http://schemas.microsoft.com/office/word/2018/wordml" xmlns:w16du="http://schemas.microsoft.com/office/word/2023/wordml/word16du" xmlns:w16sdtdh="http://schemas.microsoft.com/office/word/2020/wordml/sdtdatahash" xmlns:w16se="http://schemas.microsoft.com/office/word/2015/wordml/symex" xmlns:wpg="http://schemas.microsoft.com/office/word/2010/wordprocessingGroup" xmlns:wpi="http://schemas.microsoft.com/office/word/2010/wordprocessingInk" xmlns:wne="http://schemas.microsoft.com/office/word/2006/wordml" xmlns:wps="http://schemas.microsoft.com/office/word/2010/wordprocessingShape" mc:Ignorable="w14 w15 w16se w16cid w16 w16cex w16sdtdh wp14">
   <w:abstractNum w:abstractNumId="0" w15:restartNumberingAfterBreak="0">
     <w:nsid w:val="00307211"/>
     <w:multiLevelType w:val="hybridMultilevel"/>
@@ -9367,7 +8892,7 @@
 </file>
 
 <file path=word/styles.xml><?xml version="1.0" encoding="utf-8"?>
-<w:styles xmlns:mc="http://schemas.openxmlformats.org/markup-compatibility/2006" xmlns:r="http://schemas.openxmlformats.org/officeDocument/2006/relationships" xmlns:w="http://schemas.openxmlformats.org/wordprocessingml/2006/main" xmlns:w14="http://schemas.microsoft.com/office/word/2010/wordml" xmlns:w15="http://schemas.microsoft.com/office/word/2012/wordml" xmlns:w16cex="http://schemas.microsoft.com/office/word/2018/wordml/cex" xmlns:w16cid="http://schemas.microsoft.com/office/word/2016/wordml/cid" xmlns:w16="http://schemas.microsoft.com/office/word/2018/wordml" xmlns:w16du="http://schemas.microsoft.com/office/word/2023/wordml/word16du" xmlns:w16sdtdh="http://schemas.microsoft.com/office/word/2020/wordml/sdtdatahash" xmlns:w16sdtfl="http://schemas.microsoft.com/office/word/2024/wordml/sdtformatlock" xmlns:w16se="http://schemas.microsoft.com/office/word/2015/wordml/symex" mc:Ignorable="w14 w15 w16se w16cid w16 w16cex w16sdtdh w16sdtfl w16du">
+<w:styles xmlns:mc="http://schemas.openxmlformats.org/markup-compatibility/2006" xmlns:r="http://schemas.openxmlformats.org/officeDocument/2006/relationships" xmlns:w="http://schemas.openxmlformats.org/wordprocessingml/2006/main" xmlns:w14="http://schemas.microsoft.com/office/word/2010/wordml" xmlns:w15="http://schemas.microsoft.com/office/word/2012/wordml" xmlns:w16cex="http://schemas.microsoft.com/office/word/2018/wordml/cex" xmlns:w16cid="http://schemas.microsoft.com/office/word/2016/wordml/cid" xmlns:w16="http://schemas.microsoft.com/office/word/2018/wordml" xmlns:w16sdtdh="http://schemas.microsoft.com/office/word/2020/wordml/sdtdatahash" xmlns:w16se="http://schemas.microsoft.com/office/word/2015/wordml/symex" mc:Ignorable="w14 w15 w16se w16cid w16 w16cex w16sdtdh">
   <w:docDefaults>
     <w:rPrDefault>
       <w:rPr>

</xml_diff>